<commit_message>
docs: point README and report at the live deployment
</commit_message>
<xml_diff>
--- a/docs/Cascade-Final-Report.docx
+++ b/docs/Cascade-Final-Report.docx
@@ -47,10 +47,21 @@
         <w:rPr>
           <w:b/>
         </w:rPr>
-        <w:t>Frontend:</w:t>
+        <w:t>Live site:</w:t>
       </w:r>
       <w:r>
         <w:t xml:space="preserve"> https://cascade-red-eight.vercel.app</w:t>
+      </w:r>
+    </w:p>
+    <w:p>
+      <w:r>
+        <w:rPr>
+          <w:b/>
+        </w:rPr>
+        <w:t>API:</w:t>
+      </w:r>
+      <w:r>
+        <w:t xml:space="preserve"> https://cascade-api-5w68.onrender.com</w:t>
       </w:r>
     </w:p>
     <w:p>
@@ -3451,32 +3462,10 @@
         <w:rPr>
           <w:b/>
         </w:rPr>
-        <w:t>Only half deployed.</w:t>
+        <w:t>Both services sleep.</w:t>
       </w:r>
       <w:r>
-        <w:t xml:space="preserve"> The frontend is live at https://cascade-red-eight.vercel.app, but the API is not — the deployed bundle still points at </w:t>
-      </w:r>
-      <w:r>
-        <w:rPr>
-          <w:rFonts w:ascii="Consolas" w:hAnsi="Consolas"/>
-          <w:color w:val="4B7B6E"/>
-          <w:sz w:val="19"/>
-        </w:rPr>
-        <w:t>127.0.0.1:8000</w:t>
-      </w:r>
-      <w:r>
-        <w:t xml:space="preserve"> because </w:t>
-      </w:r>
-      <w:r>
-        <w:rPr>
-          <w:rFonts w:ascii="Consolas" w:hAnsi="Consolas"/>
-          <w:color w:val="4B7B6E"/>
-          <w:sz w:val="19"/>
-        </w:rPr>
-        <w:t>NEXT_PUBLIC_API_BASE</w:t>
-      </w:r>
-      <w:r>
-        <w:t xml:space="preserve"> has nothing to point at yet. The pages render and the layout is real, but no question can be answered through the public URL. Everything in this report was measured on a full local run, and the screenshots in </w:t>
+        <w:t xml:space="preserve"> The system is deployed and working end to end — frontend on Vercel, API on Render, database on Supabase — and the screenshots in </w:t>
       </w:r>
       <w:r>
         <w:rPr>
@@ -3487,29 +3476,7 @@
         <w:t>docs/screenshots/</w:t>
       </w:r>
       <w:r>
-        <w:t xml:space="preserve"> are from </w:t>
-      </w:r>
-      <w:r>
-        <w:rPr>
-          <w:rFonts w:ascii="Consolas" w:hAnsi="Consolas"/>
-          <w:color w:val="4B7B6E"/>
-          <w:sz w:val="19"/>
-        </w:rPr>
-        <w:t>localhost</w:t>
-      </w:r>
-      <w:r>
-        <w:t xml:space="preserve">. Finishing the deployment is the one outstanding task: create the Supabase database, deploy the backend to Render with the three provider keys, then set </w:t>
-      </w:r>
-      <w:r>
-        <w:rPr>
-          <w:rFonts w:ascii="Consolas" w:hAnsi="Consolas"/>
-          <w:color w:val="4B7B6E"/>
-          <w:sz w:val="19"/>
-        </w:rPr>
-        <w:t>NEXT_PUBLIC_API_BASE</w:t>
-      </w:r>
-      <w:r>
-        <w:t xml:space="preserve"> on Vercel and redeploy.</w:t>
+        <w:t xml:space="preserve"> are from the live site. But Render's free tier spins the container down after 15 minutes of inactivity, so the first request after a quiet period takes around 50 seconds while it wakes. A cron ping every 10 minutes keeps it warm. Supabase also pauses free projects after 7 days of no traffic, which would need a manual unpause.</w:t>
       </w:r>
     </w:p>
     <w:p>

</xml_diff>

<commit_message>
docs: complete the README and add a deployment section to the report
</commit_message>
<xml_diff>
--- a/docs/Cascade-Final-Report.docx
+++ b/docs/Cascade-Final-Report.docx
@@ -1263,7 +1263,7 @@
     </w:p>
     <w:p>
       <w:r>
-        <w:t>One qualifier, which I offer as an observation rather than evidence. The model is not degenerate — it does respond to the question. Asking the deployed service "What is 2+2?" gives T1 at 0.95 confidence, and "Prove that the square root of 2 is irrational" gives T2 at 0.90. So it has learned something. It just hasn't learned enough of it, often enough, to beat a constant.</w:t>
+        <w:t>One qualifier, which I offer as an observation rather than evidence. The model is not degenerate — it does respond to the question. Asking the deployed service "What is photosynthesis?" gives T1 at 0.99 confidence, and "Prove that the square root of 2 is irrational" gives T2 at 0.90. So it has learned something. It just hasn't learned enough of it, often enough, to beat a constant.</w:t>
       </w:r>
     </w:p>
     <w:p>
@@ -3129,6 +3129,44 @@
               <w:rPr>
                 <w:sz w:val="20"/>
               </w:rPr>
+              <w:t>Commits</w:t>
+            </w:r>
+          </w:p>
+        </w:tc>
+        <w:tc>
+          <w:tcPr>
+            <w:tcW w:type="dxa" w:w="4680"/>
+          </w:tcPr>
+          <w:p>
+            <w:r>
+              <w:rPr>
+                <w:sz w:val="20"/>
+              </w:rPr>
+            </w:r>
+            <w:r>
+              <w:rPr>
+                <w:sz w:val="20"/>
+              </w:rPr>
+              <w:t>53</w:t>
+            </w:r>
+          </w:p>
+        </w:tc>
+      </w:tr>
+      <w:tr>
+        <w:tc>
+          <w:tcPr>
+            <w:tcW w:type="dxa" w:w="4680"/>
+          </w:tcPr>
+          <w:p>
+            <w:r>
+              <w:rPr>
+                <w:sz w:val="20"/>
+              </w:rPr>
+            </w:r>
+            <w:r>
+              <w:rPr>
+                <w:sz w:val="20"/>
+              </w:rPr>
               <w:t>Groq latency</w:t>
             </w:r>
           </w:p>
@@ -3325,7 +3363,154 @@
         <w:rPr>
           <w:color w:val="14171A"/>
         </w:rPr>
-        <w:t>7. Limitations</w:t>
+        <w:t>7. Deployment</w:t>
+      </w:r>
+    </w:p>
+    <w:p>
+      <w:r>
+        <w:t>The system runs on three free services: the frontend on Vercel, the API on Render as a Docker container, and Postgres on Supabase. Total cost is zero, which was a hard constraint from the start rather than a nice-to-have.</w:t>
+      </w:r>
+    </w:p>
+    <w:p>
+      <w:r>
+        <w:t>Getting there produced four problems worth recording, because none of them were about the code being wrong.</w:t>
+      </w:r>
+    </w:p>
+    <w:p>
+      <w:r>
+        <w:rPr>
+          <w:b/>
+        </w:rPr>
+        <w:t>CI failed on a commit that was fine.</w:t>
+      </w:r>
+      <w:r>
+        <w:t xml:space="preserve"> The workflow triggered on </w:t>
+      </w:r>
+      <w:r>
+        <w:rPr>
+          <w:rFonts w:ascii="Consolas" w:hAnsi="Consolas"/>
+          <w:color w:val="4B7B6E"/>
+          <w:sz w:val="19"/>
+        </w:rPr>
+        <w:t>push</w:t>
+      </w:r>
+      <w:r>
+        <w:t xml:space="preserve"> with no ref filter, so pushing the </w:t>
+      </w:r>
+      <w:r>
+        <w:rPr>
+          <w:rFonts w:ascii="Consolas" w:hAnsi="Consolas"/>
+          <w:color w:val="4B7B6E"/>
+          <w:sz w:val="19"/>
+        </w:rPr>
+        <w:t>v0.1-proposal</w:t>
+      </w:r>
+      <w:r>
+        <w:t xml:space="preserve"> tag re-ran the whole pipeline against a commit from before a fix, and reported a failure that said nothing about the current tree. Tags label history; they are not something to re-test.</w:t>
+      </w:r>
+    </w:p>
+    <w:p>
+      <w:r>
+        <w:rPr>
+          <w:b/>
+        </w:rPr>
+        <w:t>SQLAlchemy ships no database driver.</w:t>
+      </w:r>
+      <w:r>
+        <w:t xml:space="preserve"> Everything worked locally on SQLite, which is built into Python. Pointing </w:t>
+      </w:r>
+      <w:r>
+        <w:rPr>
+          <w:rFonts w:ascii="Consolas" w:hAnsi="Consolas"/>
+          <w:color w:val="4B7B6E"/>
+          <w:sz w:val="19"/>
+        </w:rPr>
+        <w:t>DATABASE_URL</w:t>
+      </w:r>
+      <w:r>
+        <w:t xml:space="preserve"> at Supabase would have raised </w:t>
+      </w:r>
+      <w:r>
+        <w:rPr>
+          <w:rFonts w:ascii="Consolas" w:hAnsi="Consolas"/>
+          <w:color w:val="4B7B6E"/>
+          <w:sz w:val="19"/>
+        </w:rPr>
+        <w:t>ModuleNotFoundError: No module named 'psycopg2'</w:t>
+      </w:r>
+      <w:r>
+        <w:t xml:space="preserve"> on the first connection. I caught this reading the requirements file while writing the deployment guide, not from a failure — the local test suite would never have found it, because it never touches Postgres.</w:t>
+      </w:r>
+    </w:p>
+    <w:p>
+      <w:r>
+        <w:rPr>
+          <w:b/>
+        </w:rPr>
+        <w:t>Supabase's direct connection host is IPv6-only</w:t>
+      </w:r>
+      <w:r>
+        <w:t xml:space="preserve"> and Render's free tier has no IPv6. The failure mode is a connection timeout with nothing pointing at the cause. The session pooler hostname is IPv4 and works.</w:t>
+      </w:r>
+    </w:p>
+    <w:p>
+      <w:r>
+        <w:rPr>
+          <w:b/>
+        </w:rPr>
+        <w:t>`NEXT_PUBLIC_*` variables are compiled in at build time.</w:t>
+      </w:r>
+      <w:r>
+        <w:t xml:space="preserve"> Setting </w:t>
+      </w:r>
+      <w:r>
+        <w:rPr>
+          <w:rFonts w:ascii="Consolas" w:hAnsi="Consolas"/>
+          <w:color w:val="4B7B6E"/>
+          <w:sz w:val="19"/>
+        </w:rPr>
+        <w:t>NEXT_PUBLIC_API_BASE</w:t>
+      </w:r>
+      <w:r>
+        <w:t xml:space="preserve"> on Vercel changes nothing until a new build runs, and marking it "Sensitive" stops it being inlined at all — which is coherent, since sensitive means "never expose" and </w:t>
+      </w:r>
+      <w:r>
+        <w:rPr>
+          <w:rFonts w:ascii="Consolas" w:hAnsi="Consolas"/>
+          <w:color w:val="4B7B6E"/>
+          <w:sz w:val="19"/>
+        </w:rPr>
+        <w:t>NEXT_PUBLIC_</w:t>
+      </w:r>
+      <w:r>
+        <w:t xml:space="preserve"> means "expose this". The two settings contradict each other and the variable is silently dropped. The site kept serving a bundle with </w:t>
+      </w:r>
+      <w:r>
+        <w:rPr>
+          <w:rFonts w:ascii="Consolas" w:hAnsi="Consolas"/>
+          <w:color w:val="4B7B6E"/>
+          <w:sz w:val="19"/>
+        </w:rPr>
+        <w:t>127.0.0.1:8000</w:t>
+      </w:r>
+      <w:r>
+        <w:t xml:space="preserve"> compiled into it, and the browser blocked the request as mixed content before it ever left the page, so nothing appeared in the network log to debug from.</w:t>
+      </w:r>
+    </w:p>
+    <w:p>
+      <w:r>
+        <w:t>The common thread is that all four were configuration, invisible to the test suite, and produced errors that named something other than the actual problem. That is most of what deployment turned out to be.</w:t>
+      </w:r>
+    </w:p>
+    <w:p>
+      <w:pPr>
+        <w:pStyle w:val="Heading2"/>
+      </w:pPr>
+      <w:r>
+        <w:rPr>
+          <w:color w:val="14171A"/>
+        </w:rPr>
+        <w:t>8. Limitations</w:t>
       </w:r>
     </w:p>
     <w:p>
@@ -3487,7 +3672,7 @@
         <w:rPr>
           <w:color w:val="14171A"/>
         </w:rPr>
-        <w:t>8. Conclusion</w:t>
+        <w:t>9. Conclusion</w:t>
       </w:r>
     </w:p>
     <w:p>
@@ -3508,6 +3693,11 @@
     <w:p>
       <w:r>
         <w:t>If I picked this up again I wouldn't start by reaching for a better model. I'd start by asking a smaller question. "Which of three tiers does this need" demands more than the router ever uses. "Will the cheap model get this right" is one binary decision, with five times the minority data behind it, and it's the decision the system is actually making every time somebody types a question into the box.</w:t>
+      </w:r>
+    </w:p>
+    <w:p>
+      <w:r>
+        <w:t>The system is live at https://cascade-red-eight.vercel.app. Ask it something and the trace under the answer will tell you which model replied, how long it took, and what the checker made of it — including, if the first attempt wasn't good enough, the step up to a stronger one.</w:t>
       </w:r>
     </w:p>
     <w:sectPr>

</xml_diff>

<commit_message>
docs: typeset the report as a formatted document
Cover page, auto-updating contents, running header and page numbers,
banded tables, shaded code blocks, and a callout for the test-split
disclosure.
</commit_message>
<xml_diff>
--- a/docs/Cascade-Final-Report.docx
+++ b/docs/Cascade-Final-Report.docx
@@ -2,15 +2,223 @@
 <file path=word/document.xml><?xml version="1.0" encoding="utf-8"?>
 <w:document xmlns:wpc="http://schemas.microsoft.com/office/word/2010/wordprocessingCanvas" xmlns:mo="http://schemas.microsoft.com/office/mac/office/2008/main" xmlns:mc="http://schemas.openxmlformats.org/markup-compatibility/2006" xmlns:mv="urn:schemas-microsoft-com:mac:vml" xmlns:o="urn:schemas-microsoft-com:office:office" xmlns:r="http://schemas.openxmlformats.org/officeDocument/2006/relationships" xmlns:m="http://schemas.openxmlformats.org/officeDocument/2006/math" xmlns:v="urn:schemas-microsoft-com:vml" xmlns:wp14="http://schemas.microsoft.com/office/word/2010/wordprocessingDrawing" xmlns:wp="http://schemas.openxmlformats.org/drawingml/2006/wordprocessingDrawing" xmlns:w10="urn:schemas-microsoft-com:office:word" xmlns:w="http://schemas.openxmlformats.org/wordprocessingml/2006/main" xmlns:w14="http://schemas.microsoft.com/office/word/2010/wordml" xmlns:wpg="http://schemas.microsoft.com/office/word/2010/wordprocessingGroup" xmlns:wpi="http://schemas.microsoft.com/office/word/2010/wordprocessingInk" xmlns:wne="http://schemas.microsoft.com/office/word/2006/wordml" xmlns:wps="http://schemas.microsoft.com/office/word/2010/wordprocessingShape" mc:Ignorable="w14 wp14">
   <w:body>
+    <w:p/>
+    <w:p/>
+    <w:p/>
+    <w:p/>
     <w:p>
       <w:pPr>
-        <w:pStyle w:val="Title"/>
+        <w:jc w:val="center"/>
       </w:pPr>
       <w:r>
         <w:rPr>
+          <w:rFonts w:ascii="Calibri" w:hAnsi="Calibri"/>
+          <w:b/>
           <w:color w:val="4B7B6E"/>
+          <w:sz w:val="92"/>
         </w:rPr>
-        <w:t>Cascade — Final Report</w:t>
+        <w:t>Cascade</w:t>
+      </w:r>
+    </w:p>
+    <w:p>
+      <w:pPr>
+        <w:jc w:val="center"/>
+      </w:pPr>
+      <w:r>
+        <w:rPr>
+          <w:rFonts w:ascii="Georgia" w:hAnsi="Georgia"/>
+          <w:i/>
+          <w:color w:val="6B7280"/>
+          <w:sz w:val="26"/>
+        </w:rPr>
+        <w:t>Routing student questions to the cheapest model that can answer them</w:t>
+      </w:r>
+    </w:p>
+    <w:p>
+      <w:pPr>
+        <w:jc w:val="center"/>
+        <w:pBdr>
+          <w:bottom w:val="single" w:sz="8" w:space="8" w:color="C9D2C6"/>
+        </w:pBdr>
+      </w:pPr>
+    </w:p>
+    <w:p/>
+    <w:p/>
+    <w:p>
+      <w:pPr>
+        <w:spacing w:after="60"/>
+        <w:jc w:val="center"/>
+      </w:pPr>
+      <w:r>
+        <w:rPr>
+          <w:rFonts w:ascii="Calibri" w:hAnsi="Calibri"/>
+          <w:b/>
+          <w:color w:val="14171A"/>
+          <w:sz w:val="30"/>
+        </w:rPr>
+        <w:t>Md. Asif Hossain</w:t>
+      </w:r>
+    </w:p>
+    <w:p>
+      <w:pPr>
+        <w:spacing w:after="60"/>
+        <w:jc w:val="center"/>
+      </w:pPr>
+      <w:r>
+        <w:rPr>
+          <w:rFonts w:ascii="Calibri" w:hAnsi="Calibri"/>
+          <w:b w:val="0"/>
+          <w:color w:val="6B7280"/>
+          <w:sz w:val="22"/>
+        </w:rPr>
+        <w:t>Capstone Project</w:t>
+      </w:r>
+    </w:p>
+    <w:p>
+      <w:pPr>
+        <w:spacing w:after="60"/>
+        <w:jc w:val="center"/>
+      </w:pPr>
+      <w:r>
+        <w:rPr>
+          <w:rFonts w:ascii="Calibri" w:hAnsi="Calibri"/>
+          <w:b w:val="0"/>
+          <w:color w:val="6B7280"/>
+          <w:sz w:val="22"/>
+        </w:rPr>
+        <w:t>Ostad — AI Engineering</w:t>
+      </w:r>
+    </w:p>
+    <w:p>
+      <w:pPr>
+        <w:spacing w:after="60"/>
+        <w:jc w:val="center"/>
+      </w:pPr>
+      <w:r>
+        <w:rPr>
+          <w:rFonts w:ascii="Calibri" w:hAnsi="Calibri"/>
+          <w:b w:val="0"/>
+          <w:color w:val="6B7280"/>
+          <w:sz w:val="22"/>
+        </w:rPr>
+        <w:t>15 August 2026</w:t>
+      </w:r>
+    </w:p>
+    <w:p/>
+    <w:p/>
+    <w:p/>
+    <w:p/>
+    <w:p/>
+    <w:p/>
+    <w:p>
+      <w:pPr>
+        <w:spacing w:after="40"/>
+        <w:jc w:val="center"/>
+      </w:pPr>
+      <w:r>
+        <w:rPr>
+          <w:rFonts w:ascii="Calibri" w:hAnsi="Calibri"/>
+          <w:color w:val="6B7280"/>
+          <w:sz w:val="18"/>
+        </w:rPr>
+        <w:t xml:space="preserve">Live site   </w:t>
+      </w:r>
+      <w:r>
+        <w:rPr>
+          <w:rFonts w:ascii="Consolas" w:hAnsi="Consolas"/>
+          <w:color w:val="4B7B6E"/>
+          <w:sz w:val="18"/>
+        </w:rPr>
+        <w:t>https://cascade-red-eight.vercel.app</w:t>
+      </w:r>
+    </w:p>
+    <w:p>
+      <w:pPr>
+        <w:spacing w:after="40"/>
+        <w:jc w:val="center"/>
+      </w:pPr>
+      <w:r>
+        <w:rPr>
+          <w:rFonts w:ascii="Calibri" w:hAnsi="Calibri"/>
+          <w:color w:val="6B7280"/>
+          <w:sz w:val="18"/>
+        </w:rPr>
+        <w:t xml:space="preserve">API   </w:t>
+      </w:r>
+      <w:r>
+        <w:rPr>
+          <w:rFonts w:ascii="Consolas" w:hAnsi="Consolas"/>
+          <w:color w:val="4B7B6E"/>
+          <w:sz w:val="18"/>
+        </w:rPr>
+        <w:t>https://cascade-api-5w68.onrender.com</w:t>
+      </w:r>
+    </w:p>
+    <w:p>
+      <w:pPr>
+        <w:spacing w:after="40"/>
+        <w:jc w:val="center"/>
+      </w:pPr>
+      <w:r>
+        <w:rPr>
+          <w:rFonts w:ascii="Calibri" w:hAnsi="Calibri"/>
+          <w:color w:val="6B7280"/>
+          <w:sz w:val="18"/>
+        </w:rPr>
+        <w:t xml:space="preserve">Repository   </w:t>
+      </w:r>
+      <w:r>
+        <w:rPr>
+          <w:rFonts w:ascii="Consolas" w:hAnsi="Consolas"/>
+          <w:color w:val="4B7B6E"/>
+          <w:sz w:val="18"/>
+        </w:rPr>
+        <w:t>https://github.com/MdAsif-Hossain/Cascade</w:t>
+      </w:r>
+    </w:p>
+    <w:p>
+      <w:r>
+        <w:br w:type="page"/>
+      </w:r>
+    </w:p>
+    <w:p>
+      <w:pPr>
+        <w:spacing w:after="240"/>
+      </w:pPr>
+      <w:r>
+        <w:rPr>
+          <w:rFonts w:ascii="Calibri" w:hAnsi="Calibri"/>
+          <w:b/>
+          <w:color w:val="4B7B6E"/>
+          <w:sz w:val="36"/>
+        </w:rPr>
+        <w:t>Contents</w:t>
+      </w:r>
+    </w:p>
+    <w:p>
+      <w:r>
+        <w:fldChar w:fldCharType="begin"/>
+        <w:instrText xml:space="preserve">TOC \o "1-3" \h \z \u</w:instrText>
+        <w:fldChar w:fldCharType="separate"/>
+        <w:fldChar w:fldCharType="end"/>
+      </w:r>
+    </w:p>
+    <w:p>
+      <w:pPr>
+        <w:spacing w:before="280"/>
+      </w:pPr>
+      <w:r>
+        <w:rPr>
+          <w:i/>
+          <w:color w:val="6B7280"/>
+          <w:sz w:val="17"/>
+        </w:rPr>
+        <w:t>If the contents above appear empty, select them and press F9 to update the field.</w:t>
+      </w:r>
+    </w:p>
+    <w:p>
+      <w:r>
+        <w:br w:type="page"/>
       </w:r>
     </w:p>
     <w:p>
@@ -69,9 +277,6 @@
         <w:pStyle w:val="Heading2"/>
       </w:pPr>
       <w:r>
-        <w:rPr>
-          <w:color w:val="14171A"/>
-        </w:rPr>
         <w:t>1. What I set out to do</w:t>
       </w:r>
     </w:p>
@@ -88,6 +293,7 @@
     <w:p>
       <w:pPr>
         <w:pStyle w:val="ListNumber"/>
+        <w:spacing w:after="80"/>
       </w:pPr>
       <w:r>
         <w:t>A trained difficulty classifier</w:t>
@@ -96,6 +302,7 @@
     <w:p>
       <w:pPr>
         <w:pStyle w:val="ListNumber"/>
+        <w:spacing w:after="80"/>
       </w:pPr>
       <w:r>
         <w:t>A quality verifier with an escalation loop</w:t>
@@ -104,6 +311,7 @@
     <w:p>
       <w:pPr>
         <w:pStyle w:val="ListNumber"/>
+        <w:spacing w:after="80"/>
       </w:pPr>
       <w:r>
         <w:t>Catalog drift detection</w:t>
@@ -121,7 +329,7 @@
       <w:r>
         <w:drawing>
           <wp:inline xmlns:a="http://schemas.openxmlformats.org/drawingml/2006/main" xmlns:pic="http://schemas.openxmlformats.org/drawingml/2006/picture">
-            <wp:extent cx="5760720" cy="4491990"/>
+            <wp:extent cx="5577840" cy="4349387"/>
             <wp:docPr id="1" name="Picture 1"/>
             <wp:cNvGraphicFramePr>
               <a:graphicFrameLocks noChangeAspect="1"/>
@@ -134,7 +342,7 @@
                     <pic:cNvPicPr/>
                   </pic:nvPicPr>
                   <pic:blipFill>
-                    <a:blip r:embed="rId9"/>
+                    <a:blip r:embed="rId11"/>
                     <a:stretch>
                       <a:fillRect/>
                     </a:stretch>
@@ -142,7 +350,7 @@
                   <pic:spPr>
                     <a:xfrm>
                       <a:off x="0" y="0"/>
-                      <a:ext cx="5760720" cy="4491990"/>
+                      <a:ext cx="5577840" cy="4349387"/>
                     </a:xfrm>
                     <a:prstGeom prst="rect"/>
                   </pic:spPr>
@@ -155,15 +363,17 @@
     </w:p>
     <w:p>
       <w:pPr>
+        <w:spacing w:before="80"/>
         <w:jc w:val="center"/>
       </w:pPr>
       <w:r>
         <w:rPr>
+          <w:rFonts w:ascii="Calibri" w:hAnsi="Calibri"/>
           <w:i/>
           <w:color w:val="6B7280"/>
-          <w:sz w:val="18"/>
+          <w:sz w:val="17"/>
         </w:rPr>
-        <w:t>Cascade architecture</w:t>
+        <w:t>Figure 1. Cascade architecture</w:t>
       </w:r>
     </w:p>
     <w:p>
@@ -176,9 +386,6 @@
         <w:pStyle w:val="Heading2"/>
       </w:pPr>
       <w:r>
-        <w:rPr>
-          <w:color w:val="14171A"/>
-        </w:rPr>
         <w:t>2. Getting the labels</w:t>
       </w:r>
     </w:p>
@@ -194,8 +401,8 @@
       <w:r>
         <w:rPr>
           <w:rFonts w:ascii="Consolas" w:hAnsi="Consolas"/>
-          <w:color w:val="4B7B6E"/>
-          <w:sz w:val="19"/>
+          <w:color w:val="8B4A6B"/>
+          <w:sz w:val="18"/>
         </w:rPr>
         <w:t>llama-3.1-8b-instant</w:t>
       </w:r>
@@ -205,8 +412,8 @@
       <w:r>
         <w:rPr>
           <w:rFonts w:ascii="Consolas" w:hAnsi="Consolas"/>
-          <w:color w:val="4B7B6E"/>
-          <w:sz w:val="19"/>
+          <w:color w:val="8B4A6B"/>
+          <w:sz w:val="18"/>
         </w:rPr>
         <w:t>gemini-3.1-flash-lite</w:t>
       </w:r>
@@ -219,6 +426,7 @@
         <w:tblStyle w:val="TableGrid"/>
         <w:tblW w:type="auto" w:w="0"/>
         <w:jc w:val="center"/>
+        <w:tblLayout w:type="autofit"/>
         <w:tblLook w:firstColumn="1" w:firstRow="1" w:lastColumn="0" w:lastRow="0" w:noHBand="0" w:noVBand="1" w:val="04A0"/>
       </w:tblPr>
       <w:tblGrid>
@@ -231,19 +439,23 @@
         <w:tc>
           <w:tcPr>
             <w:tcW w:type="dxa" w:w="2340"/>
-            <w:shd w:fill="EAEEE8"/>
+            <w:shd w:val="clear" w:fill="EAEEE8"/>
           </w:tcPr>
           <w:p>
+            <w:pPr>
+              <w:spacing w:after="60" w:before="60"/>
+            </w:pPr>
             <w:r>
               <w:rPr>
+                <w:rFonts w:ascii="Calibri" w:hAnsi="Calibri"/>
                 <w:b/>
-                <w:sz w:val="20"/>
               </w:rPr>
             </w:r>
             <w:r>
               <w:rPr>
+                <w:rFonts w:ascii="Calibri" w:hAnsi="Calibri"/>
                 <w:b/>
-                <w:sz w:val="20"/>
+                <w:sz w:val="19"/>
               </w:rPr>
               <w:t>Label</w:t>
             </w:r>
@@ -252,19 +464,23 @@
         <w:tc>
           <w:tcPr>
             <w:tcW w:type="dxa" w:w="2340"/>
-            <w:shd w:fill="EAEEE8"/>
+            <w:shd w:val="clear" w:fill="EAEEE8"/>
           </w:tcPr>
           <w:p>
+            <w:pPr>
+              <w:spacing w:after="60" w:before="60"/>
+            </w:pPr>
             <w:r>
               <w:rPr>
+                <w:rFonts w:ascii="Calibri" w:hAnsi="Calibri"/>
                 <w:b/>
-                <w:sz w:val="20"/>
               </w:rPr>
             </w:r>
             <w:r>
               <w:rPr>
+                <w:rFonts w:ascii="Calibri" w:hAnsi="Calibri"/>
                 <w:b/>
-                <w:sz w:val="20"/>
+                <w:sz w:val="19"/>
               </w:rPr>
               <w:t>Meaning</w:t>
             </w:r>
@@ -273,19 +489,23 @@
         <w:tc>
           <w:tcPr>
             <w:tcW w:type="dxa" w:w="2340"/>
-            <w:shd w:fill="EAEEE8"/>
+            <w:shd w:val="clear" w:fill="EAEEE8"/>
           </w:tcPr>
           <w:p>
+            <w:pPr>
+              <w:spacing w:after="60" w:before="60"/>
+            </w:pPr>
             <w:r>
               <w:rPr>
+                <w:rFonts w:ascii="Calibri" w:hAnsi="Calibri"/>
                 <w:b/>
-                <w:sz w:val="20"/>
               </w:rPr>
             </w:r>
             <w:r>
               <w:rPr>
+                <w:rFonts w:ascii="Calibri" w:hAnsi="Calibri"/>
                 <w:b/>
-                <w:sz w:val="20"/>
+                <w:sz w:val="19"/>
               </w:rPr>
               <w:t>Count</w:t>
             </w:r>
@@ -294,19 +514,23 @@
         <w:tc>
           <w:tcPr>
             <w:tcW w:type="dxa" w:w="2340"/>
-            <w:shd w:fill="EAEEE8"/>
+            <w:shd w:val="clear" w:fill="EAEEE8"/>
           </w:tcPr>
           <w:p>
+            <w:pPr>
+              <w:spacing w:after="60" w:before="60"/>
+            </w:pPr>
             <w:r>
               <w:rPr>
+                <w:rFonts w:ascii="Calibri" w:hAnsi="Calibri"/>
                 <w:b/>
-                <w:sz w:val="20"/>
               </w:rPr>
             </w:r>
             <w:r>
               <w:rPr>
+                <w:rFonts w:ascii="Calibri" w:hAnsi="Calibri"/>
                 <w:b/>
-                <w:sz w:val="20"/>
+                <w:sz w:val="19"/>
               </w:rPr>
               <w:t>Share</w:t>
             </w:r>
@@ -319,14 +543,18 @@
             <w:tcW w:type="dxa" w:w="2340"/>
           </w:tcPr>
           <w:p>
+            <w:pPr>
+              <w:spacing w:after="40" w:before="40"/>
+            </w:pPr>
             <w:r>
               <w:rPr>
-                <w:sz w:val="20"/>
+                <w:rFonts w:ascii="Calibri" w:hAnsi="Calibri"/>
               </w:rPr>
             </w:r>
             <w:r>
               <w:rPr>
-                <w:sz w:val="20"/>
+                <w:rFonts w:ascii="Calibri" w:hAnsi="Calibri"/>
+                <w:sz w:val="19"/>
               </w:rPr>
               <w:t>T1</w:t>
             </w:r>
@@ -337,14 +565,18 @@
             <w:tcW w:type="dxa" w:w="2340"/>
           </w:tcPr>
           <w:p>
+            <w:pPr>
+              <w:spacing w:after="40" w:before="40"/>
+            </w:pPr>
             <w:r>
               <w:rPr>
-                <w:sz w:val="20"/>
+                <w:rFonts w:ascii="Calibri" w:hAnsi="Calibri"/>
               </w:rPr>
             </w:r>
             <w:r>
               <w:rPr>
-                <w:sz w:val="20"/>
+                <w:rFonts w:ascii="Calibri" w:hAnsi="Calibri"/>
+                <w:sz w:val="19"/>
               </w:rPr>
               <w:t>The small model got it right</w:t>
             </w:r>
@@ -355,14 +587,19 @@
             <w:tcW w:type="dxa" w:w="2340"/>
           </w:tcPr>
           <w:p>
+            <w:pPr>
+              <w:spacing w:after="40" w:before="40"/>
+              <w:jc w:val="right"/>
+            </w:pPr>
             <w:r>
               <w:rPr>
-                <w:sz w:val="20"/>
+                <w:rFonts w:ascii="Calibri" w:hAnsi="Calibri"/>
               </w:rPr>
             </w:r>
             <w:r>
               <w:rPr>
-                <w:sz w:val="20"/>
+                <w:rFonts w:ascii="Calibri" w:hAnsi="Calibri"/>
+                <w:sz w:val="19"/>
               </w:rPr>
               <w:t>1,052</w:t>
             </w:r>
@@ -373,14 +610,19 @@
             <w:tcW w:type="dxa" w:w="2340"/>
           </w:tcPr>
           <w:p>
+            <w:pPr>
+              <w:spacing w:after="40" w:before="40"/>
+              <w:jc w:val="right"/>
+            </w:pPr>
             <w:r>
               <w:rPr>
-                <w:sz w:val="20"/>
+                <w:rFonts w:ascii="Calibri" w:hAnsi="Calibri"/>
               </w:rPr>
             </w:r>
             <w:r>
               <w:rPr>
-                <w:sz w:val="20"/>
+                <w:rFonts w:ascii="Calibri" w:hAnsi="Calibri"/>
+                <w:sz w:val="19"/>
               </w:rPr>
               <w:t>84.2%</w:t>
             </w:r>
@@ -391,16 +633,21 @@
         <w:tc>
           <w:tcPr>
             <w:tcW w:type="dxa" w:w="2340"/>
+            <w:shd w:val="clear" w:fill="F7F8F6"/>
           </w:tcPr>
           <w:p>
+            <w:pPr>
+              <w:spacing w:after="40" w:before="40"/>
+            </w:pPr>
             <w:r>
               <w:rPr>
-                <w:sz w:val="20"/>
+                <w:rFonts w:ascii="Calibri" w:hAnsi="Calibri"/>
               </w:rPr>
             </w:r>
             <w:r>
               <w:rPr>
-                <w:sz w:val="20"/>
+                <w:rFonts w:ascii="Calibri" w:hAnsi="Calibri"/>
+                <w:sz w:val="19"/>
               </w:rPr>
               <w:t>T2</w:t>
             </w:r>
@@ -409,16 +656,21 @@
         <w:tc>
           <w:tcPr>
             <w:tcW w:type="dxa" w:w="2340"/>
+            <w:shd w:val="clear" w:fill="F7F8F6"/>
           </w:tcPr>
           <w:p>
+            <w:pPr>
+              <w:spacing w:after="40" w:before="40"/>
+            </w:pPr>
             <w:r>
               <w:rPr>
-                <w:sz w:val="20"/>
+                <w:rFonts w:ascii="Calibri" w:hAnsi="Calibri"/>
               </w:rPr>
             </w:r>
             <w:r>
               <w:rPr>
-                <w:sz w:val="20"/>
+                <w:rFonts w:ascii="Calibri" w:hAnsi="Calibri"/>
+                <w:sz w:val="19"/>
               </w:rPr>
               <w:t>T1 missed, the mid model got it</w:t>
             </w:r>
@@ -427,16 +679,22 @@
         <w:tc>
           <w:tcPr>
             <w:tcW w:type="dxa" w:w="2340"/>
+            <w:shd w:val="clear" w:fill="F7F8F6"/>
           </w:tcPr>
           <w:p>
+            <w:pPr>
+              <w:spacing w:after="40" w:before="40"/>
+              <w:jc w:val="right"/>
+            </w:pPr>
             <w:r>
               <w:rPr>
-                <w:sz w:val="20"/>
+                <w:rFonts w:ascii="Calibri" w:hAnsi="Calibri"/>
               </w:rPr>
             </w:r>
             <w:r>
               <w:rPr>
-                <w:sz w:val="20"/>
+                <w:rFonts w:ascii="Calibri" w:hAnsi="Calibri"/>
+                <w:sz w:val="19"/>
               </w:rPr>
               <w:t>179</w:t>
             </w:r>
@@ -445,16 +703,22 @@
         <w:tc>
           <w:tcPr>
             <w:tcW w:type="dxa" w:w="2340"/>
+            <w:shd w:val="clear" w:fill="F7F8F6"/>
           </w:tcPr>
           <w:p>
+            <w:pPr>
+              <w:spacing w:after="40" w:before="40"/>
+              <w:jc w:val="right"/>
+            </w:pPr>
             <w:r>
               <w:rPr>
-                <w:sz w:val="20"/>
+                <w:rFonts w:ascii="Calibri" w:hAnsi="Calibri"/>
               </w:rPr>
             </w:r>
             <w:r>
               <w:rPr>
-                <w:sz w:val="20"/>
+                <w:rFonts w:ascii="Calibri" w:hAnsi="Calibri"/>
+                <w:sz w:val="19"/>
               </w:rPr>
               <w:t>14.3%</w:t>
             </w:r>
@@ -467,14 +731,18 @@
             <w:tcW w:type="dxa" w:w="2340"/>
           </w:tcPr>
           <w:p>
+            <w:pPr>
+              <w:spacing w:after="40" w:before="40"/>
+            </w:pPr>
             <w:r>
               <w:rPr>
-                <w:sz w:val="20"/>
+                <w:rFonts w:ascii="Calibri" w:hAnsi="Calibri"/>
               </w:rPr>
             </w:r>
             <w:r>
               <w:rPr>
-                <w:sz w:val="20"/>
+                <w:rFonts w:ascii="Calibri" w:hAnsi="Calibri"/>
+                <w:sz w:val="19"/>
               </w:rPr>
               <w:t>T3</w:t>
             </w:r>
@@ -485,14 +753,18 @@
             <w:tcW w:type="dxa" w:w="2340"/>
           </w:tcPr>
           <w:p>
+            <w:pPr>
+              <w:spacing w:after="40" w:before="40"/>
+            </w:pPr>
             <w:r>
               <w:rPr>
-                <w:sz w:val="20"/>
+                <w:rFonts w:ascii="Calibri" w:hAnsi="Calibri"/>
               </w:rPr>
             </w:r>
             <w:r>
               <w:rPr>
-                <w:sz w:val="20"/>
+                <w:rFonts w:ascii="Calibri" w:hAnsi="Calibri"/>
+                <w:sz w:val="19"/>
               </w:rPr>
               <w:t>Both missed</w:t>
             </w:r>
@@ -503,14 +775,19 @@
             <w:tcW w:type="dxa" w:w="2340"/>
           </w:tcPr>
           <w:p>
+            <w:pPr>
+              <w:spacing w:after="40" w:before="40"/>
+              <w:jc w:val="right"/>
+            </w:pPr>
             <w:r>
               <w:rPr>
-                <w:sz w:val="20"/>
+                <w:rFonts w:ascii="Calibri" w:hAnsi="Calibri"/>
               </w:rPr>
             </w:r>
             <w:r>
               <w:rPr>
-                <w:sz w:val="20"/>
+                <w:rFonts w:ascii="Calibri" w:hAnsi="Calibri"/>
+                <w:sz w:val="19"/>
               </w:rPr>
               <w:t>18</w:t>
             </w:r>
@@ -521,14 +798,19 @@
             <w:tcW w:type="dxa" w:w="2340"/>
           </w:tcPr>
           <w:p>
+            <w:pPr>
+              <w:spacing w:after="40" w:before="40"/>
+              <w:jc w:val="right"/>
+            </w:pPr>
             <w:r>
               <w:rPr>
-                <w:sz w:val="20"/>
+                <w:rFonts w:ascii="Calibri" w:hAnsi="Calibri"/>
               </w:rPr>
             </w:r>
             <w:r>
               <w:rPr>
-                <w:sz w:val="20"/>
+                <w:rFonts w:ascii="Calibri" w:hAnsi="Calibri"/>
+                <w:sz w:val="19"/>
               </w:rPr>
               <w:t>1.4%</w:t>
             </w:r>
@@ -536,7 +818,11 @@
         </w:tc>
       </w:tr>
     </w:tbl>
-    <w:p/>
+    <w:p>
+      <w:pPr>
+        <w:spacing w:after="80"/>
+      </w:pPr>
+    </w:p>
     <w:p>
       <w:r>
         <w:t xml:space="preserve">The headline number here is good news for the product and bad news for the classifier. </w:t>
@@ -564,11 +850,9 @@
     <w:p>
       <w:pPr>
         <w:pStyle w:val="Heading2"/>
+        <w:pageBreakBefore/>
       </w:pPr>
       <w:r>
-        <w:rPr>
-          <w:color w:val="14171A"/>
-        </w:rPr>
         <w:t>3. The classifier</w:t>
       </w:r>
     </w:p>
@@ -577,9 +861,6 @@
         <w:pStyle w:val="Heading3"/>
       </w:pPr>
       <w:r>
-        <w:rPr>
-          <w:color w:val="14171A"/>
-        </w:rPr>
         <w:t>3.1 The result</w:t>
       </w:r>
     </w:p>
@@ -588,6 +869,7 @@
         <w:tblStyle w:val="TableGrid"/>
         <w:tblW w:type="auto" w:w="0"/>
         <w:jc w:val="center"/>
+        <w:tblLayout w:type="autofit"/>
         <w:tblLook w:firstColumn="1" w:firstRow="1" w:lastColumn="0" w:lastRow="0" w:noHBand="0" w:noVBand="1" w:val="04A0"/>
       </w:tblPr>
       <w:tblGrid>
@@ -598,19 +880,23 @@
         <w:tc>
           <w:tcPr>
             <w:tcW w:type="dxa" w:w="4680"/>
-            <w:shd w:fill="EAEEE8"/>
+            <w:shd w:val="clear" w:fill="EAEEE8"/>
           </w:tcPr>
           <w:p>
+            <w:pPr>
+              <w:spacing w:after="60" w:before="60"/>
+            </w:pPr>
             <w:r>
               <w:rPr>
+                <w:rFonts w:ascii="Calibri" w:hAnsi="Calibri"/>
                 <w:b/>
-                <w:sz w:val="20"/>
               </w:rPr>
             </w:r>
             <w:r>
               <w:rPr>
+                <w:rFonts w:ascii="Calibri" w:hAnsi="Calibri"/>
                 <w:b/>
-                <w:sz w:val="20"/>
+                <w:sz w:val="19"/>
               </w:rPr>
               <w:t>Metric</w:t>
             </w:r>
@@ -619,19 +905,23 @@
         <w:tc>
           <w:tcPr>
             <w:tcW w:type="dxa" w:w="4680"/>
-            <w:shd w:fill="EAEEE8"/>
+            <w:shd w:val="clear" w:fill="EAEEE8"/>
           </w:tcPr>
           <w:p>
+            <w:pPr>
+              <w:spacing w:after="60" w:before="60"/>
+            </w:pPr>
             <w:r>
               <w:rPr>
+                <w:rFonts w:ascii="Calibri" w:hAnsi="Calibri"/>
                 <w:b/>
-                <w:sz w:val="20"/>
               </w:rPr>
             </w:r>
             <w:r>
               <w:rPr>
+                <w:rFonts w:ascii="Calibri" w:hAnsi="Calibri"/>
                 <w:b/>
-                <w:sz w:val="20"/>
+                <w:sz w:val="19"/>
               </w:rPr>
               <w:t>Value</w:t>
             </w:r>
@@ -644,14 +934,18 @@
             <w:tcW w:type="dxa" w:w="4680"/>
           </w:tcPr>
           <w:p>
+            <w:pPr>
+              <w:spacing w:after="40" w:before="40"/>
+            </w:pPr>
             <w:r>
               <w:rPr>
-                <w:sz w:val="20"/>
+                <w:rFonts w:ascii="Calibri" w:hAnsi="Calibri"/>
               </w:rPr>
             </w:r>
             <w:r>
               <w:rPr>
-                <w:sz w:val="20"/>
+                <w:rFonts w:ascii="Calibri" w:hAnsi="Calibri"/>
+                <w:sz w:val="19"/>
               </w:rPr>
               <w:t>Accuracy</w:t>
             </w:r>
@@ -662,14 +956,18 @@
             <w:tcW w:type="dxa" w:w="4680"/>
           </w:tcPr>
           <w:p>
+            <w:pPr>
+              <w:spacing w:after="40" w:before="40"/>
+            </w:pPr>
             <w:r>
               <w:rPr>
-                <w:sz w:val="20"/>
+                <w:rFonts w:ascii="Calibri" w:hAnsi="Calibri"/>
               </w:rPr>
             </w:r>
             <w:r>
               <w:rPr>
-                <w:sz w:val="20"/>
+                <w:rFonts w:ascii="Calibri" w:hAnsi="Calibri"/>
+                <w:sz w:val="19"/>
               </w:rPr>
               <w:t>0.8333</w:t>
             </w:r>
@@ -680,16 +978,21 @@
         <w:tc>
           <w:tcPr>
             <w:tcW w:type="dxa" w:w="4680"/>
+            <w:shd w:val="clear" w:fill="F7F8F6"/>
           </w:tcPr>
           <w:p>
+            <w:pPr>
+              <w:spacing w:after="40" w:before="40"/>
+            </w:pPr>
             <w:r>
               <w:rPr>
-                <w:sz w:val="20"/>
+                <w:rFonts w:ascii="Calibri" w:hAnsi="Calibri"/>
               </w:rPr>
             </w:r>
             <w:r>
               <w:rPr>
-                <w:sz w:val="20"/>
+                <w:rFonts w:ascii="Calibri" w:hAnsi="Calibri"/>
+                <w:sz w:val="19"/>
               </w:rPr>
               <w:t>Majority-class baseline</w:t>
             </w:r>
@@ -698,16 +1001,21 @@
         <w:tc>
           <w:tcPr>
             <w:tcW w:type="dxa" w:w="4680"/>
+            <w:shd w:val="clear" w:fill="F7F8F6"/>
           </w:tcPr>
           <w:p>
+            <w:pPr>
+              <w:spacing w:after="40" w:before="40"/>
+            </w:pPr>
             <w:r>
               <w:rPr>
-                <w:sz w:val="20"/>
+                <w:rFonts w:ascii="Calibri" w:hAnsi="Calibri"/>
               </w:rPr>
             </w:r>
             <w:r>
               <w:rPr>
-                <w:sz w:val="20"/>
+                <w:rFonts w:ascii="Calibri" w:hAnsi="Calibri"/>
+                <w:sz w:val="19"/>
               </w:rPr>
               <w:t>0.8400</w:t>
             </w:r>
@@ -720,14 +1028,18 @@
             <w:tcW w:type="dxa" w:w="4680"/>
           </w:tcPr>
           <w:p>
+            <w:pPr>
+              <w:spacing w:after="40" w:before="40"/>
+            </w:pPr>
             <w:r>
               <w:rPr>
-                <w:sz w:val="20"/>
+                <w:rFonts w:ascii="Calibri" w:hAnsi="Calibri"/>
               </w:rPr>
             </w:r>
             <w:r>
               <w:rPr>
-                <w:sz w:val="20"/>
+                <w:rFonts w:ascii="Calibri" w:hAnsi="Calibri"/>
+                <w:sz w:val="19"/>
               </w:rPr>
               <w:t>Difference</w:t>
             </w:r>
@@ -738,15 +1050,19 @@
             <w:tcW w:type="dxa" w:w="4680"/>
           </w:tcPr>
           <w:p>
+            <w:pPr>
+              <w:spacing w:after="40" w:before="40"/>
+            </w:pPr>
             <w:r>
               <w:rPr>
-                <w:sz w:val="20"/>
+                <w:rFonts w:ascii="Calibri" w:hAnsi="Calibri"/>
               </w:rPr>
             </w:r>
             <w:r>
               <w:rPr>
+                <w:rFonts w:ascii="Calibri" w:hAnsi="Calibri"/>
                 <w:b/>
-                <w:sz w:val="20"/>
+                <w:sz w:val="19"/>
               </w:rPr>
               <w:t>−0.0067</w:t>
             </w:r>
@@ -757,16 +1073,21 @@
         <w:tc>
           <w:tcPr>
             <w:tcW w:type="dxa" w:w="4680"/>
+            <w:shd w:val="clear" w:fill="F7F8F6"/>
           </w:tcPr>
           <w:p>
+            <w:pPr>
+              <w:spacing w:after="40" w:before="40"/>
+            </w:pPr>
             <w:r>
               <w:rPr>
-                <w:sz w:val="20"/>
+                <w:rFonts w:ascii="Calibri" w:hAnsi="Calibri"/>
               </w:rPr>
             </w:r>
             <w:r>
               <w:rPr>
-                <w:sz w:val="20"/>
+                <w:rFonts w:ascii="Calibri" w:hAnsi="Calibri"/>
+                <w:sz w:val="19"/>
               </w:rPr>
               <w:t>Macro-F1</w:t>
             </w:r>
@@ -775,16 +1096,21 @@
         <w:tc>
           <w:tcPr>
             <w:tcW w:type="dxa" w:w="4680"/>
+            <w:shd w:val="clear" w:fill="F7F8F6"/>
           </w:tcPr>
           <w:p>
+            <w:pPr>
+              <w:spacing w:after="40" w:before="40"/>
+            </w:pPr>
             <w:r>
               <w:rPr>
-                <w:sz w:val="20"/>
+                <w:rFonts w:ascii="Calibri" w:hAnsi="Calibri"/>
               </w:rPr>
             </w:r>
             <w:r>
               <w:rPr>
-                <w:sz w:val="20"/>
+                <w:rFonts w:ascii="Calibri" w:hAnsi="Calibri"/>
+                <w:sz w:val="19"/>
               </w:rPr>
               <w:t>0.3550</w:t>
             </w:r>
@@ -797,14 +1123,18 @@
             <w:tcW w:type="dxa" w:w="4680"/>
           </w:tcPr>
           <w:p>
+            <w:pPr>
+              <w:spacing w:after="40" w:before="40"/>
+            </w:pPr>
             <w:r>
               <w:rPr>
-                <w:sz w:val="20"/>
+                <w:rFonts w:ascii="Calibri" w:hAnsi="Calibri"/>
               </w:rPr>
             </w:r>
             <w:r>
               <w:rPr>
-                <w:sz w:val="20"/>
+                <w:rFonts w:ascii="Calibri" w:hAnsi="Calibri"/>
+                <w:sz w:val="19"/>
               </w:rPr>
               <w:t>Test size</w:t>
             </w:r>
@@ -815,14 +1145,18 @@
             <w:tcW w:type="dxa" w:w="4680"/>
           </w:tcPr>
           <w:p>
+            <w:pPr>
+              <w:spacing w:after="40" w:before="40"/>
+            </w:pPr>
             <w:r>
               <w:rPr>
-                <w:sz w:val="20"/>
+                <w:rFonts w:ascii="Calibri" w:hAnsi="Calibri"/>
               </w:rPr>
             </w:r>
             <w:r>
               <w:rPr>
-                <w:sz w:val="20"/>
+                <w:rFonts w:ascii="Calibri" w:hAnsi="Calibri"/>
+                <w:sz w:val="19"/>
               </w:rPr>
               <w:t>150</w:t>
             </w:r>
@@ -830,12 +1164,17 @@
         </w:tc>
       </w:tr>
     </w:tbl>
-    <w:p/>
+    <w:p>
+      <w:pPr>
+        <w:spacing w:after="80"/>
+      </w:pPr>
+    </w:p>
     <w:tbl>
       <w:tblPr>
         <w:tblStyle w:val="TableGrid"/>
         <w:tblW w:type="auto" w:w="0"/>
         <w:jc w:val="center"/>
+        <w:tblLayout w:type="autofit"/>
         <w:tblLook w:firstColumn="1" w:firstRow="1" w:lastColumn="0" w:lastRow="0" w:noHBand="0" w:noVBand="1" w:val="04A0"/>
       </w:tblPr>
       <w:tblGrid>
@@ -849,19 +1188,23 @@
         <w:tc>
           <w:tcPr>
             <w:tcW w:type="dxa" w:w="1872"/>
-            <w:shd w:fill="EAEEE8"/>
+            <w:shd w:val="clear" w:fill="EAEEE8"/>
           </w:tcPr>
           <w:p>
+            <w:pPr>
+              <w:spacing w:after="60" w:before="60"/>
+            </w:pPr>
             <w:r>
               <w:rPr>
+                <w:rFonts w:ascii="Calibri" w:hAnsi="Calibri"/>
                 <w:b/>
-                <w:sz w:val="20"/>
               </w:rPr>
             </w:r>
             <w:r>
               <w:rPr>
+                <w:rFonts w:ascii="Calibri" w:hAnsi="Calibri"/>
                 <w:b/>
-                <w:sz w:val="20"/>
+                <w:sz w:val="19"/>
               </w:rPr>
               <w:t>Tier</w:t>
             </w:r>
@@ -870,19 +1213,23 @@
         <w:tc>
           <w:tcPr>
             <w:tcW w:type="dxa" w:w="1872"/>
-            <w:shd w:fill="EAEEE8"/>
+            <w:shd w:val="clear" w:fill="EAEEE8"/>
           </w:tcPr>
           <w:p>
+            <w:pPr>
+              <w:spacing w:after="60" w:before="60"/>
+            </w:pPr>
             <w:r>
               <w:rPr>
+                <w:rFonts w:ascii="Calibri" w:hAnsi="Calibri"/>
                 <w:b/>
-                <w:sz w:val="20"/>
               </w:rPr>
             </w:r>
             <w:r>
               <w:rPr>
+                <w:rFonts w:ascii="Calibri" w:hAnsi="Calibri"/>
                 <w:b/>
-                <w:sz w:val="20"/>
+                <w:sz w:val="19"/>
               </w:rPr>
               <w:t>Precision</w:t>
             </w:r>
@@ -891,19 +1238,23 @@
         <w:tc>
           <w:tcPr>
             <w:tcW w:type="dxa" w:w="1872"/>
-            <w:shd w:fill="EAEEE8"/>
+            <w:shd w:val="clear" w:fill="EAEEE8"/>
           </w:tcPr>
           <w:p>
+            <w:pPr>
+              <w:spacing w:after="60" w:before="60"/>
+            </w:pPr>
             <w:r>
               <w:rPr>
+                <w:rFonts w:ascii="Calibri" w:hAnsi="Calibri"/>
                 <w:b/>
-                <w:sz w:val="20"/>
               </w:rPr>
             </w:r>
             <w:r>
               <w:rPr>
+                <w:rFonts w:ascii="Calibri" w:hAnsi="Calibri"/>
                 <w:b/>
-                <w:sz w:val="20"/>
+                <w:sz w:val="19"/>
               </w:rPr>
               <w:t>Recall</w:t>
             </w:r>
@@ -912,19 +1263,23 @@
         <w:tc>
           <w:tcPr>
             <w:tcW w:type="dxa" w:w="1872"/>
-            <w:shd w:fill="EAEEE8"/>
+            <w:shd w:val="clear" w:fill="EAEEE8"/>
           </w:tcPr>
           <w:p>
+            <w:pPr>
+              <w:spacing w:after="60" w:before="60"/>
+            </w:pPr>
             <w:r>
               <w:rPr>
+                <w:rFonts w:ascii="Calibri" w:hAnsi="Calibri"/>
                 <w:b/>
-                <w:sz w:val="20"/>
               </w:rPr>
             </w:r>
             <w:r>
               <w:rPr>
+                <w:rFonts w:ascii="Calibri" w:hAnsi="Calibri"/>
                 <w:b/>
-                <w:sz w:val="20"/>
+                <w:sz w:val="19"/>
               </w:rPr>
               <w:t>F1</w:t>
             </w:r>
@@ -933,19 +1288,23 @@
         <w:tc>
           <w:tcPr>
             <w:tcW w:type="dxa" w:w="1872"/>
-            <w:shd w:fill="EAEEE8"/>
+            <w:shd w:val="clear" w:fill="EAEEE8"/>
           </w:tcPr>
           <w:p>
+            <w:pPr>
+              <w:spacing w:after="60" w:before="60"/>
+            </w:pPr>
             <w:r>
               <w:rPr>
+                <w:rFonts w:ascii="Calibri" w:hAnsi="Calibri"/>
                 <w:b/>
-                <w:sz w:val="20"/>
               </w:rPr>
             </w:r>
             <w:r>
               <w:rPr>
+                <w:rFonts w:ascii="Calibri" w:hAnsi="Calibri"/>
                 <w:b/>
-                <w:sz w:val="20"/>
+                <w:sz w:val="19"/>
               </w:rPr>
               <w:t>Support</w:t>
             </w:r>
@@ -958,14 +1317,18 @@
             <w:tcW w:type="dxa" w:w="1872"/>
           </w:tcPr>
           <w:p>
+            <w:pPr>
+              <w:spacing w:after="40" w:before="40"/>
+            </w:pPr>
             <w:r>
               <w:rPr>
-                <w:sz w:val="20"/>
+                <w:rFonts w:ascii="Calibri" w:hAnsi="Calibri"/>
               </w:rPr>
             </w:r>
             <w:r>
               <w:rPr>
-                <w:sz w:val="20"/>
+                <w:rFonts w:ascii="Calibri" w:hAnsi="Calibri"/>
+                <w:sz w:val="19"/>
               </w:rPr>
               <w:t>T1</w:t>
             </w:r>
@@ -976,14 +1339,19 @@
             <w:tcW w:type="dxa" w:w="1872"/>
           </w:tcPr>
           <w:p>
+            <w:pPr>
+              <w:spacing w:after="40" w:before="40"/>
+              <w:jc w:val="right"/>
+            </w:pPr>
             <w:r>
               <w:rPr>
-                <w:sz w:val="20"/>
+                <w:rFonts w:ascii="Calibri" w:hAnsi="Calibri"/>
               </w:rPr>
             </w:r>
             <w:r>
               <w:rPr>
-                <w:sz w:val="20"/>
+                <w:rFonts w:ascii="Calibri" w:hAnsi="Calibri"/>
+                <w:sz w:val="19"/>
               </w:rPr>
               <w:t>0.85</w:t>
             </w:r>
@@ -994,14 +1362,19 @@
             <w:tcW w:type="dxa" w:w="1872"/>
           </w:tcPr>
           <w:p>
+            <w:pPr>
+              <w:spacing w:after="40" w:before="40"/>
+              <w:jc w:val="right"/>
+            </w:pPr>
             <w:r>
               <w:rPr>
-                <w:sz w:val="20"/>
+                <w:rFonts w:ascii="Calibri" w:hAnsi="Calibri"/>
               </w:rPr>
             </w:r>
             <w:r>
               <w:rPr>
-                <w:sz w:val="20"/>
+                <w:rFonts w:ascii="Calibri" w:hAnsi="Calibri"/>
+                <w:sz w:val="19"/>
               </w:rPr>
               <w:t>0.98</w:t>
             </w:r>
@@ -1012,14 +1385,19 @@
             <w:tcW w:type="dxa" w:w="1872"/>
           </w:tcPr>
           <w:p>
+            <w:pPr>
+              <w:spacing w:after="40" w:before="40"/>
+              <w:jc w:val="right"/>
+            </w:pPr>
             <w:r>
               <w:rPr>
-                <w:sz w:val="20"/>
+                <w:rFonts w:ascii="Calibri" w:hAnsi="Calibri"/>
               </w:rPr>
             </w:r>
             <w:r>
               <w:rPr>
-                <w:sz w:val="20"/>
+                <w:rFonts w:ascii="Calibri" w:hAnsi="Calibri"/>
+                <w:sz w:val="19"/>
               </w:rPr>
               <w:t>0.91</w:t>
             </w:r>
@@ -1030,14 +1408,19 @@
             <w:tcW w:type="dxa" w:w="1872"/>
           </w:tcPr>
           <w:p>
+            <w:pPr>
+              <w:spacing w:after="40" w:before="40"/>
+              <w:jc w:val="right"/>
+            </w:pPr>
             <w:r>
               <w:rPr>
-                <w:sz w:val="20"/>
+                <w:rFonts w:ascii="Calibri" w:hAnsi="Calibri"/>
               </w:rPr>
             </w:r>
             <w:r>
               <w:rPr>
-                <w:sz w:val="20"/>
+                <w:rFonts w:ascii="Calibri" w:hAnsi="Calibri"/>
+                <w:sz w:val="19"/>
               </w:rPr>
               <w:t>126</w:t>
             </w:r>
@@ -1048,16 +1431,21 @@
         <w:tc>
           <w:tcPr>
             <w:tcW w:type="dxa" w:w="1872"/>
+            <w:shd w:val="clear" w:fill="F7F8F6"/>
           </w:tcPr>
           <w:p>
+            <w:pPr>
+              <w:spacing w:after="40" w:before="40"/>
+            </w:pPr>
             <w:r>
               <w:rPr>
-                <w:sz w:val="20"/>
+                <w:rFonts w:ascii="Calibri" w:hAnsi="Calibri"/>
               </w:rPr>
             </w:r>
             <w:r>
               <w:rPr>
-                <w:sz w:val="20"/>
+                <w:rFonts w:ascii="Calibri" w:hAnsi="Calibri"/>
+                <w:sz w:val="19"/>
               </w:rPr>
               <w:t>T2</w:t>
             </w:r>
@@ -1066,16 +1454,22 @@
         <w:tc>
           <w:tcPr>
             <w:tcW w:type="dxa" w:w="1872"/>
+            <w:shd w:val="clear" w:fill="F7F8F6"/>
           </w:tcPr>
           <w:p>
+            <w:pPr>
+              <w:spacing w:after="40" w:before="40"/>
+              <w:jc w:val="right"/>
+            </w:pPr>
             <w:r>
               <w:rPr>
-                <w:sz w:val="20"/>
+                <w:rFonts w:ascii="Calibri" w:hAnsi="Calibri"/>
               </w:rPr>
             </w:r>
             <w:r>
               <w:rPr>
-                <w:sz w:val="20"/>
+                <w:rFonts w:ascii="Calibri" w:hAnsi="Calibri"/>
+                <w:sz w:val="19"/>
               </w:rPr>
               <w:t>0.50</w:t>
             </w:r>
@@ -1084,16 +1478,22 @@
         <w:tc>
           <w:tcPr>
             <w:tcW w:type="dxa" w:w="1872"/>
+            <w:shd w:val="clear" w:fill="F7F8F6"/>
           </w:tcPr>
           <w:p>
+            <w:pPr>
+              <w:spacing w:after="40" w:before="40"/>
+              <w:jc w:val="right"/>
+            </w:pPr>
             <w:r>
               <w:rPr>
-                <w:sz w:val="20"/>
+                <w:rFonts w:ascii="Calibri" w:hAnsi="Calibri"/>
               </w:rPr>
             </w:r>
             <w:r>
               <w:rPr>
-                <w:sz w:val="20"/>
+                <w:rFonts w:ascii="Calibri" w:hAnsi="Calibri"/>
+                <w:sz w:val="19"/>
               </w:rPr>
               <w:t>0.09</w:t>
             </w:r>
@@ -1102,16 +1502,22 @@
         <w:tc>
           <w:tcPr>
             <w:tcW w:type="dxa" w:w="1872"/>
+            <w:shd w:val="clear" w:fill="F7F8F6"/>
           </w:tcPr>
           <w:p>
+            <w:pPr>
+              <w:spacing w:after="40" w:before="40"/>
+              <w:jc w:val="right"/>
+            </w:pPr>
             <w:r>
               <w:rPr>
-                <w:sz w:val="20"/>
+                <w:rFonts w:ascii="Calibri" w:hAnsi="Calibri"/>
               </w:rPr>
             </w:r>
             <w:r>
               <w:rPr>
-                <w:sz w:val="20"/>
+                <w:rFonts w:ascii="Calibri" w:hAnsi="Calibri"/>
+                <w:sz w:val="19"/>
               </w:rPr>
               <w:t>0.15</w:t>
             </w:r>
@@ -1120,16 +1526,22 @@
         <w:tc>
           <w:tcPr>
             <w:tcW w:type="dxa" w:w="1872"/>
+            <w:shd w:val="clear" w:fill="F7F8F6"/>
           </w:tcPr>
           <w:p>
+            <w:pPr>
+              <w:spacing w:after="40" w:before="40"/>
+              <w:jc w:val="right"/>
+            </w:pPr>
             <w:r>
               <w:rPr>
-                <w:sz w:val="20"/>
+                <w:rFonts w:ascii="Calibri" w:hAnsi="Calibri"/>
               </w:rPr>
             </w:r>
             <w:r>
               <w:rPr>
-                <w:sz w:val="20"/>
+                <w:rFonts w:ascii="Calibri" w:hAnsi="Calibri"/>
+                <w:sz w:val="19"/>
               </w:rPr>
               <w:t>22</w:t>
             </w:r>
@@ -1142,14 +1554,18 @@
             <w:tcW w:type="dxa" w:w="1872"/>
           </w:tcPr>
           <w:p>
+            <w:pPr>
+              <w:spacing w:after="40" w:before="40"/>
+            </w:pPr>
             <w:r>
               <w:rPr>
-                <w:sz w:val="20"/>
+                <w:rFonts w:ascii="Calibri" w:hAnsi="Calibri"/>
               </w:rPr>
             </w:r>
             <w:r>
               <w:rPr>
-                <w:sz w:val="20"/>
+                <w:rFonts w:ascii="Calibri" w:hAnsi="Calibri"/>
+                <w:sz w:val="19"/>
               </w:rPr>
               <w:t>T3</w:t>
             </w:r>
@@ -1160,14 +1576,19 @@
             <w:tcW w:type="dxa" w:w="1872"/>
           </w:tcPr>
           <w:p>
+            <w:pPr>
+              <w:spacing w:after="40" w:before="40"/>
+              <w:jc w:val="right"/>
+            </w:pPr>
             <w:r>
               <w:rPr>
-                <w:sz w:val="20"/>
+                <w:rFonts w:ascii="Calibri" w:hAnsi="Calibri"/>
               </w:rPr>
             </w:r>
             <w:r>
               <w:rPr>
-                <w:sz w:val="20"/>
+                <w:rFonts w:ascii="Calibri" w:hAnsi="Calibri"/>
+                <w:sz w:val="19"/>
               </w:rPr>
               <w:t>0.00</w:t>
             </w:r>
@@ -1178,14 +1599,19 @@
             <w:tcW w:type="dxa" w:w="1872"/>
           </w:tcPr>
           <w:p>
+            <w:pPr>
+              <w:spacing w:after="40" w:before="40"/>
+              <w:jc w:val="right"/>
+            </w:pPr>
             <w:r>
               <w:rPr>
-                <w:sz w:val="20"/>
+                <w:rFonts w:ascii="Calibri" w:hAnsi="Calibri"/>
               </w:rPr>
             </w:r>
             <w:r>
               <w:rPr>
-                <w:sz w:val="20"/>
+                <w:rFonts w:ascii="Calibri" w:hAnsi="Calibri"/>
+                <w:sz w:val="19"/>
               </w:rPr>
               <w:t>0.00</w:t>
             </w:r>
@@ -1196,14 +1622,19 @@
             <w:tcW w:type="dxa" w:w="1872"/>
           </w:tcPr>
           <w:p>
+            <w:pPr>
+              <w:spacing w:after="40" w:before="40"/>
+              <w:jc w:val="right"/>
+            </w:pPr>
             <w:r>
               <w:rPr>
-                <w:sz w:val="20"/>
+                <w:rFonts w:ascii="Calibri" w:hAnsi="Calibri"/>
               </w:rPr>
             </w:r>
             <w:r>
               <w:rPr>
-                <w:sz w:val="20"/>
+                <w:rFonts w:ascii="Calibri" w:hAnsi="Calibri"/>
+                <w:sz w:val="19"/>
               </w:rPr>
               <w:t>0.00</w:t>
             </w:r>
@@ -1214,14 +1645,19 @@
             <w:tcW w:type="dxa" w:w="1872"/>
           </w:tcPr>
           <w:p>
+            <w:pPr>
+              <w:spacing w:after="40" w:before="40"/>
+              <w:jc w:val="right"/>
+            </w:pPr>
             <w:r>
               <w:rPr>
-                <w:sz w:val="20"/>
+                <w:rFonts w:ascii="Calibri" w:hAnsi="Calibri"/>
               </w:rPr>
             </w:r>
             <w:r>
               <w:rPr>
-                <w:sz w:val="20"/>
+                <w:rFonts w:ascii="Calibri" w:hAnsi="Calibri"/>
+                <w:sz w:val="19"/>
               </w:rPr>
               <w:t>2</w:t>
             </w:r>
@@ -1229,7 +1665,11 @@
         </w:tc>
       </w:tr>
     </w:tbl>
-    <w:p/>
+    <w:p>
+      <w:pPr>
+        <w:spacing w:after="80"/>
+      </w:pPr>
+    </w:p>
     <w:p>
       <w:r>
         <w:t>The confusion matrix says it plainly. Of 22 T2 questions the model found 2. Of the 2 T3 questions it found none. It sends almost everything to T1, and it is very slightly worse at that than a rule which just says "T1" every time and reads nothing.</w:t>
@@ -1237,13 +1677,18 @@
     </w:p>
     <w:p>
       <w:pPr>
-        <w:spacing w:before="120"/>
-        <w:ind w:left="432"/>
+        <w:spacing w:before="160" w:after="200" w:line="240" w:lineRule="auto"/>
+        <w:ind w:left="360"/>
+        <w:shd w:val="clear" w:fill="F2F4F1"/>
+        <w:pBdr>
+          <w:left w:val="single" w:sz="12" w:space="8" w:color="C9D2C6"/>
+        </w:pBdr>
       </w:pPr>
       <w:r>
         <w:rPr>
           <w:rFonts w:ascii="Consolas" w:hAnsi="Consolas"/>
-          <w:sz w:val="18"/>
+          <w:color w:val="14171A"/>
+          <w:sz w:val="17"/>
         </w:rPr>
         <w:t xml:space="preserve">              predicted</w:t>
         <w:br/>
@@ -1267,35 +1712,53 @@
       </w:r>
     </w:p>
     <w:p>
+      <w:pPr>
+        <w:spacing w:before="200" w:after="200"/>
+        <w:ind w:left="317"/>
+        <w:shd w:val="clear" w:fill="FDF6E9"/>
+        <w:pBdr>
+          <w:left w:val="single" w:sz="20" w:space="8" w:color="C08A2E"/>
+        </w:pBdr>
+      </w:pPr>
       <w:r>
         <w:rPr>
           <w:b/>
+          <w:sz w:val="20"/>
         </w:rPr>
         <w:t>A note on how many times I used the test split.</w:t>
       </w:r>
       <w:r>
+        <w:rPr>
+          <w:sz w:val="20"/>
+        </w:rPr>
         <w:t xml:space="preserve"> The plan was to touch it once, at the end. I touched it twice. The first evaluation ran, and afterwards I found a feature that leaked (§3.3), removed it, retrained, and evaluated again. Both results are in the repository — </w:t>
       </w:r>
       <w:r>
         <w:rPr>
           <w:rFonts w:ascii="Consolas" w:hAnsi="Consolas"/>
-          <w:color w:val="4B7B6E"/>
-          <w:sz w:val="19"/>
+          <w:color w:val="8B4A6B"/>
+          <w:sz w:val="20"/>
         </w:rPr>
         <w:t>test_results_v1_with_leak.json</w:t>
       </w:r>
       <w:r>
+        <w:rPr>
+          <w:sz w:val="20"/>
+        </w:rPr>
         <w:t xml:space="preserve"> from the first run (accuracy 0.8400) and </w:t>
       </w:r>
       <w:r>
         <w:rPr>
           <w:rFonts w:ascii="Consolas" w:hAnsi="Consolas"/>
-          <w:color w:val="4B7B6E"/>
-          <w:sz w:val="19"/>
+          <w:color w:val="8B4A6B"/>
+          <w:sz w:val="20"/>
         </w:rPr>
         <w:t>test_results.json</w:t>
       </w:r>
       <w:r>
+        <w:rPr>
+          <w:sz w:val="20"/>
+        </w:rPr>
         <w:t xml:space="preserve"> from the second. Nothing was tuned between them; the only change was deleting a broken feature. The gap between the two runs is one question out of 150 and the conclusion is the same either way, but two evaluations is a weaker claim than one and I would rather say so than quietly publish the better-looking number.</w:t>
       </w:r>
     </w:p>
@@ -1304,9 +1767,6 @@
         <w:pStyle w:val="Heading3"/>
       </w:pPr>
       <w:r>
-        <w:rPr>
-          <w:color w:val="14171A"/>
-        </w:rPr>
         <w:t>3.2 The ablation</w:t>
       </w:r>
     </w:p>
@@ -1320,6 +1780,7 @@
         <w:tblStyle w:val="TableGrid"/>
         <w:tblW w:type="auto" w:w="0"/>
         <w:jc w:val="center"/>
+        <w:tblLayout w:type="autofit"/>
         <w:tblLook w:firstColumn="1" w:firstRow="1" w:lastColumn="0" w:lastRow="0" w:noHBand="0" w:noVBand="1" w:val="04A0"/>
       </w:tblPr>
       <w:tblGrid>
@@ -1333,19 +1794,23 @@
         <w:tc>
           <w:tcPr>
             <w:tcW w:type="dxa" w:w="1872"/>
-            <w:shd w:fill="EAEEE8"/>
+            <w:shd w:val="clear" w:fill="EAEEE8"/>
           </w:tcPr>
           <w:p>
+            <w:pPr>
+              <w:spacing w:after="60" w:before="60"/>
+            </w:pPr>
             <w:r>
               <w:rPr>
+                <w:rFonts w:ascii="Calibri" w:hAnsi="Calibri"/>
                 <w:b/>
-                <w:sz w:val="20"/>
               </w:rPr>
             </w:r>
             <w:r>
               <w:rPr>
+                <w:rFonts w:ascii="Calibri" w:hAnsi="Calibri"/>
                 <w:b/>
-                <w:sz w:val="20"/>
+                <w:sz w:val="19"/>
               </w:rPr>
               <w:t>Model</w:t>
             </w:r>
@@ -1354,19 +1819,23 @@
         <w:tc>
           <w:tcPr>
             <w:tcW w:type="dxa" w:w="1872"/>
-            <w:shd w:fill="EAEEE8"/>
+            <w:shd w:val="clear" w:fill="EAEEE8"/>
           </w:tcPr>
           <w:p>
+            <w:pPr>
+              <w:spacing w:after="60" w:before="60"/>
+            </w:pPr>
             <w:r>
               <w:rPr>
+                <w:rFonts w:ascii="Calibri" w:hAnsi="Calibri"/>
                 <w:b/>
-                <w:sz w:val="20"/>
               </w:rPr>
             </w:r>
             <w:r>
               <w:rPr>
+                <w:rFonts w:ascii="Calibri" w:hAnsi="Calibri"/>
                 <w:b/>
-                <w:sz w:val="20"/>
+                <w:sz w:val="19"/>
               </w:rPr>
               <w:t>Features</w:t>
             </w:r>
@@ -1375,19 +1844,23 @@
         <w:tc>
           <w:tcPr>
             <w:tcW w:type="dxa" w:w="1872"/>
-            <w:shd w:fill="EAEEE8"/>
+            <w:shd w:val="clear" w:fill="EAEEE8"/>
           </w:tcPr>
           <w:p>
+            <w:pPr>
+              <w:spacing w:after="60" w:before="60"/>
+            </w:pPr>
             <w:r>
               <w:rPr>
+                <w:rFonts w:ascii="Calibri" w:hAnsi="Calibri"/>
                 <w:b/>
-                <w:sz w:val="20"/>
               </w:rPr>
             </w:r>
             <w:r>
               <w:rPr>
+                <w:rFonts w:ascii="Calibri" w:hAnsi="Calibri"/>
                 <w:b/>
-                <w:sz w:val="20"/>
+                <w:sz w:val="19"/>
               </w:rPr>
               <w:t>Dims</w:t>
             </w:r>
@@ -1396,19 +1869,23 @@
         <w:tc>
           <w:tcPr>
             <w:tcW w:type="dxa" w:w="1872"/>
-            <w:shd w:fill="EAEEE8"/>
+            <w:shd w:val="clear" w:fill="EAEEE8"/>
           </w:tcPr>
           <w:p>
+            <w:pPr>
+              <w:spacing w:after="60" w:before="60"/>
+            </w:pPr>
             <w:r>
               <w:rPr>
+                <w:rFonts w:ascii="Calibri" w:hAnsi="Calibri"/>
                 <w:b/>
-                <w:sz w:val="20"/>
               </w:rPr>
             </w:r>
             <w:r>
               <w:rPr>
+                <w:rFonts w:ascii="Calibri" w:hAnsi="Calibri"/>
                 <w:b/>
-                <w:sz w:val="20"/>
+                <w:sz w:val="19"/>
               </w:rPr>
               <w:t>Accuracy</w:t>
             </w:r>
@@ -1417,19 +1894,23 @@
         <w:tc>
           <w:tcPr>
             <w:tcW w:type="dxa" w:w="1872"/>
-            <w:shd w:fill="EAEEE8"/>
+            <w:shd w:val="clear" w:fill="EAEEE8"/>
           </w:tcPr>
           <w:p>
+            <w:pPr>
+              <w:spacing w:after="60" w:before="60"/>
+            </w:pPr>
             <w:r>
               <w:rPr>
+                <w:rFonts w:ascii="Calibri" w:hAnsi="Calibri"/>
                 <w:b/>
-                <w:sz w:val="20"/>
               </w:rPr>
             </w:r>
             <w:r>
               <w:rPr>
+                <w:rFonts w:ascii="Calibri" w:hAnsi="Calibri"/>
                 <w:b/>
-                <w:sz w:val="20"/>
+                <w:sz w:val="19"/>
               </w:rPr>
               <w:t>Macro-F1</w:t>
             </w:r>
@@ -1442,14 +1923,18 @@
             <w:tcW w:type="dxa" w:w="1872"/>
           </w:tcPr>
           <w:p>
+            <w:pPr>
+              <w:spacing w:after="40" w:before="40"/>
+            </w:pPr>
             <w:r>
               <w:rPr>
-                <w:sz w:val="20"/>
+                <w:rFonts w:ascii="Calibri" w:hAnsi="Calibri"/>
               </w:rPr>
             </w:r>
             <w:r>
               <w:rPr>
-                <w:sz w:val="20"/>
+                <w:rFonts w:ascii="Calibri" w:hAnsi="Calibri"/>
+                <w:sz w:val="19"/>
               </w:rPr>
               <w:t>logistic</w:t>
             </w:r>
@@ -1460,14 +1945,18 @@
             <w:tcW w:type="dxa" w:w="1872"/>
           </w:tcPr>
           <w:p>
+            <w:pPr>
+              <w:spacing w:after="40" w:before="40"/>
+            </w:pPr>
             <w:r>
               <w:rPr>
-                <w:sz w:val="20"/>
+                <w:rFonts w:ascii="Calibri" w:hAnsi="Calibri"/>
               </w:rPr>
             </w:r>
             <w:r>
               <w:rPr>
-                <w:sz w:val="20"/>
+                <w:rFonts w:ascii="Calibri" w:hAnsi="Calibri"/>
+                <w:sz w:val="19"/>
               </w:rPr>
               <w:t>handcrafted</w:t>
             </w:r>
@@ -1478,14 +1967,19 @@
             <w:tcW w:type="dxa" w:w="1872"/>
           </w:tcPr>
           <w:p>
+            <w:pPr>
+              <w:spacing w:after="40" w:before="40"/>
+              <w:jc w:val="right"/>
+            </w:pPr>
             <w:r>
               <w:rPr>
-                <w:sz w:val="20"/>
+                <w:rFonts w:ascii="Calibri" w:hAnsi="Calibri"/>
               </w:rPr>
             </w:r>
             <w:r>
               <w:rPr>
-                <w:sz w:val="20"/>
+                <w:rFonts w:ascii="Calibri" w:hAnsi="Calibri"/>
+                <w:sz w:val="19"/>
               </w:rPr>
               <w:t>22</w:t>
             </w:r>
@@ -1496,14 +1990,19 @@
             <w:tcW w:type="dxa" w:w="1872"/>
           </w:tcPr>
           <w:p>
+            <w:pPr>
+              <w:spacing w:after="40" w:before="40"/>
+              <w:jc w:val="right"/>
+            </w:pPr>
             <w:r>
               <w:rPr>
-                <w:sz w:val="20"/>
+                <w:rFonts w:ascii="Calibri" w:hAnsi="Calibri"/>
               </w:rPr>
             </w:r>
             <w:r>
               <w:rPr>
-                <w:sz w:val="20"/>
+                <w:rFonts w:ascii="Calibri" w:hAnsi="Calibri"/>
+                <w:sz w:val="19"/>
               </w:rPr>
               <w:t>0.396</w:t>
             </w:r>
@@ -1514,14 +2013,19 @@
             <w:tcW w:type="dxa" w:w="1872"/>
           </w:tcPr>
           <w:p>
+            <w:pPr>
+              <w:spacing w:after="40" w:before="40"/>
+              <w:jc w:val="right"/>
+            </w:pPr>
             <w:r>
               <w:rPr>
-                <w:sz w:val="20"/>
+                <w:rFonts w:ascii="Calibri" w:hAnsi="Calibri"/>
               </w:rPr>
             </w:r>
             <w:r>
               <w:rPr>
-                <w:sz w:val="20"/>
+                <w:rFonts w:ascii="Calibri" w:hAnsi="Calibri"/>
+                <w:sz w:val="19"/>
               </w:rPr>
               <w:t>0.230</w:t>
             </w:r>
@@ -1532,16 +2036,21 @@
         <w:tc>
           <w:tcPr>
             <w:tcW w:type="dxa" w:w="1872"/>
+            <w:shd w:val="clear" w:fill="F7F8F6"/>
           </w:tcPr>
           <w:p>
+            <w:pPr>
+              <w:spacing w:after="40" w:before="40"/>
+            </w:pPr>
             <w:r>
               <w:rPr>
-                <w:sz w:val="20"/>
+                <w:rFonts w:ascii="Calibri" w:hAnsi="Calibri"/>
               </w:rPr>
             </w:r>
             <w:r>
               <w:rPr>
-                <w:sz w:val="20"/>
+                <w:rFonts w:ascii="Calibri" w:hAnsi="Calibri"/>
+                <w:sz w:val="19"/>
               </w:rPr>
               <w:t>logistic</w:t>
             </w:r>
@@ -1550,16 +2059,21 @@
         <w:tc>
           <w:tcPr>
             <w:tcW w:type="dxa" w:w="1872"/>
+            <w:shd w:val="clear" w:fill="F7F8F6"/>
           </w:tcPr>
           <w:p>
+            <w:pPr>
+              <w:spacing w:after="40" w:before="40"/>
+            </w:pPr>
             <w:r>
               <w:rPr>
-                <w:sz w:val="20"/>
+                <w:rFonts w:ascii="Calibri" w:hAnsi="Calibri"/>
               </w:rPr>
             </w:r>
             <w:r>
               <w:rPr>
-                <w:sz w:val="20"/>
+                <w:rFonts w:ascii="Calibri" w:hAnsi="Calibri"/>
+                <w:sz w:val="19"/>
               </w:rPr>
               <w:t>embedding</w:t>
             </w:r>
@@ -1568,16 +2082,22 @@
         <w:tc>
           <w:tcPr>
             <w:tcW w:type="dxa" w:w="1872"/>
+            <w:shd w:val="clear" w:fill="F7F8F6"/>
           </w:tcPr>
           <w:p>
+            <w:pPr>
+              <w:spacing w:after="40" w:before="40"/>
+              <w:jc w:val="right"/>
+            </w:pPr>
             <w:r>
               <w:rPr>
-                <w:sz w:val="20"/>
+                <w:rFonts w:ascii="Calibri" w:hAnsi="Calibri"/>
               </w:rPr>
             </w:r>
             <w:r>
               <w:rPr>
-                <w:sz w:val="20"/>
+                <w:rFonts w:ascii="Calibri" w:hAnsi="Calibri"/>
+                <w:sz w:val="19"/>
               </w:rPr>
               <w:t>256</w:t>
             </w:r>
@@ -1586,16 +2106,22 @@
         <w:tc>
           <w:tcPr>
             <w:tcW w:type="dxa" w:w="1872"/>
+            <w:shd w:val="clear" w:fill="F7F8F6"/>
           </w:tcPr>
           <w:p>
+            <w:pPr>
+              <w:spacing w:after="40" w:before="40"/>
+              <w:jc w:val="right"/>
+            </w:pPr>
             <w:r>
               <w:rPr>
-                <w:sz w:val="20"/>
+                <w:rFonts w:ascii="Calibri" w:hAnsi="Calibri"/>
               </w:rPr>
             </w:r>
             <w:r>
               <w:rPr>
-                <w:sz w:val="20"/>
+                <w:rFonts w:ascii="Calibri" w:hAnsi="Calibri"/>
+                <w:sz w:val="19"/>
               </w:rPr>
               <w:t>0.638</w:t>
             </w:r>
@@ -1604,16 +2130,22 @@
         <w:tc>
           <w:tcPr>
             <w:tcW w:type="dxa" w:w="1872"/>
+            <w:shd w:val="clear" w:fill="F7F8F6"/>
           </w:tcPr>
           <w:p>
+            <w:pPr>
+              <w:spacing w:after="40" w:before="40"/>
+              <w:jc w:val="right"/>
+            </w:pPr>
             <w:r>
               <w:rPr>
-                <w:sz w:val="20"/>
+                <w:rFonts w:ascii="Calibri" w:hAnsi="Calibri"/>
               </w:rPr>
             </w:r>
             <w:r>
               <w:rPr>
-                <w:sz w:val="20"/>
+                <w:rFonts w:ascii="Calibri" w:hAnsi="Calibri"/>
+                <w:sz w:val="19"/>
               </w:rPr>
               <w:t>0.302</w:t>
             </w:r>
@@ -1626,14 +2158,18 @@
             <w:tcW w:type="dxa" w:w="1872"/>
           </w:tcPr>
           <w:p>
+            <w:pPr>
+              <w:spacing w:after="40" w:before="40"/>
+            </w:pPr>
             <w:r>
               <w:rPr>
-                <w:sz w:val="20"/>
+                <w:rFonts w:ascii="Calibri" w:hAnsi="Calibri"/>
               </w:rPr>
             </w:r>
             <w:r>
               <w:rPr>
-                <w:sz w:val="20"/>
+                <w:rFonts w:ascii="Calibri" w:hAnsi="Calibri"/>
+                <w:sz w:val="19"/>
               </w:rPr>
               <w:t>logistic</w:t>
             </w:r>
@@ -1644,14 +2180,18 @@
             <w:tcW w:type="dxa" w:w="1872"/>
           </w:tcPr>
           <w:p>
+            <w:pPr>
+              <w:spacing w:after="40" w:before="40"/>
+            </w:pPr>
             <w:r>
               <w:rPr>
-                <w:sz w:val="20"/>
+                <w:rFonts w:ascii="Calibri" w:hAnsi="Calibri"/>
               </w:rPr>
             </w:r>
             <w:r>
               <w:rPr>
-                <w:sz w:val="20"/>
+                <w:rFonts w:ascii="Calibri" w:hAnsi="Calibri"/>
+                <w:sz w:val="19"/>
               </w:rPr>
               <w:t>both</w:t>
             </w:r>
@@ -1662,14 +2202,19 @@
             <w:tcW w:type="dxa" w:w="1872"/>
           </w:tcPr>
           <w:p>
+            <w:pPr>
+              <w:spacing w:after="40" w:before="40"/>
+              <w:jc w:val="right"/>
+            </w:pPr>
             <w:r>
               <w:rPr>
-                <w:sz w:val="20"/>
+                <w:rFonts w:ascii="Calibri" w:hAnsi="Calibri"/>
               </w:rPr>
             </w:r>
             <w:r>
               <w:rPr>
-                <w:sz w:val="20"/>
+                <w:rFonts w:ascii="Calibri" w:hAnsi="Calibri"/>
+                <w:sz w:val="19"/>
               </w:rPr>
               <w:t>278</w:t>
             </w:r>
@@ -1680,14 +2225,19 @@
             <w:tcW w:type="dxa" w:w="1872"/>
           </w:tcPr>
           <w:p>
+            <w:pPr>
+              <w:spacing w:after="40" w:before="40"/>
+              <w:jc w:val="right"/>
+            </w:pPr>
             <w:r>
               <w:rPr>
-                <w:sz w:val="20"/>
+                <w:rFonts w:ascii="Calibri" w:hAnsi="Calibri"/>
               </w:rPr>
             </w:r>
             <w:r>
               <w:rPr>
-                <w:sz w:val="20"/>
+                <w:rFonts w:ascii="Calibri" w:hAnsi="Calibri"/>
+                <w:sz w:val="19"/>
               </w:rPr>
               <w:t>0.671</w:t>
             </w:r>
@@ -1698,14 +2248,19 @@
             <w:tcW w:type="dxa" w:w="1872"/>
           </w:tcPr>
           <w:p>
+            <w:pPr>
+              <w:spacing w:after="40" w:before="40"/>
+              <w:jc w:val="right"/>
+            </w:pPr>
             <w:r>
               <w:rPr>
-                <w:sz w:val="20"/>
+                <w:rFonts w:ascii="Calibri" w:hAnsi="Calibri"/>
               </w:rPr>
             </w:r>
             <w:r>
               <w:rPr>
-                <w:sz w:val="20"/>
+                <w:rFonts w:ascii="Calibri" w:hAnsi="Calibri"/>
+                <w:sz w:val="19"/>
               </w:rPr>
               <w:t>0.304</w:t>
             </w:r>
@@ -1716,16 +2271,21 @@
         <w:tc>
           <w:tcPr>
             <w:tcW w:type="dxa" w:w="1872"/>
+            <w:shd w:val="clear" w:fill="F7F8F6"/>
           </w:tcPr>
           <w:p>
+            <w:pPr>
+              <w:spacing w:after="40" w:before="40"/>
+            </w:pPr>
             <w:r>
               <w:rPr>
-                <w:sz w:val="20"/>
+                <w:rFonts w:ascii="Calibri" w:hAnsi="Calibri"/>
               </w:rPr>
             </w:r>
             <w:r>
               <w:rPr>
-                <w:sz w:val="20"/>
+                <w:rFonts w:ascii="Calibri" w:hAnsi="Calibri"/>
+                <w:sz w:val="19"/>
               </w:rPr>
               <w:t>boosting</w:t>
             </w:r>
@@ -1734,16 +2294,21 @@
         <w:tc>
           <w:tcPr>
             <w:tcW w:type="dxa" w:w="1872"/>
+            <w:shd w:val="clear" w:fill="F7F8F6"/>
           </w:tcPr>
           <w:p>
+            <w:pPr>
+              <w:spacing w:after="40" w:before="40"/>
+            </w:pPr>
             <w:r>
               <w:rPr>
-                <w:sz w:val="20"/>
+                <w:rFonts w:ascii="Calibri" w:hAnsi="Calibri"/>
               </w:rPr>
             </w:r>
             <w:r>
               <w:rPr>
-                <w:sz w:val="20"/>
+                <w:rFonts w:ascii="Calibri" w:hAnsi="Calibri"/>
+                <w:sz w:val="19"/>
               </w:rPr>
               <w:t>handcrafted</w:t>
             </w:r>
@@ -1752,16 +2317,22 @@
         <w:tc>
           <w:tcPr>
             <w:tcW w:type="dxa" w:w="1872"/>
+            <w:shd w:val="clear" w:fill="F7F8F6"/>
           </w:tcPr>
           <w:p>
+            <w:pPr>
+              <w:spacing w:after="40" w:before="40"/>
+              <w:jc w:val="right"/>
+            </w:pPr>
             <w:r>
               <w:rPr>
-                <w:sz w:val="20"/>
+                <w:rFonts w:ascii="Calibri" w:hAnsi="Calibri"/>
               </w:rPr>
             </w:r>
             <w:r>
               <w:rPr>
-                <w:sz w:val="20"/>
+                <w:rFonts w:ascii="Calibri" w:hAnsi="Calibri"/>
+                <w:sz w:val="19"/>
               </w:rPr>
               <w:t>22</w:t>
             </w:r>
@@ -1770,16 +2341,22 @@
         <w:tc>
           <w:tcPr>
             <w:tcW w:type="dxa" w:w="1872"/>
+            <w:shd w:val="clear" w:fill="F7F8F6"/>
           </w:tcPr>
           <w:p>
+            <w:pPr>
+              <w:spacing w:after="40" w:before="40"/>
+              <w:jc w:val="right"/>
+            </w:pPr>
             <w:r>
               <w:rPr>
-                <w:sz w:val="20"/>
+                <w:rFonts w:ascii="Calibri" w:hAnsi="Calibri"/>
               </w:rPr>
             </w:r>
             <w:r>
               <w:rPr>
-                <w:sz w:val="20"/>
+                <w:rFonts w:ascii="Calibri" w:hAnsi="Calibri"/>
+                <w:sz w:val="19"/>
               </w:rPr>
               <w:t>0.846</w:t>
             </w:r>
@@ -1788,16 +2365,22 @@
         <w:tc>
           <w:tcPr>
             <w:tcW w:type="dxa" w:w="1872"/>
+            <w:shd w:val="clear" w:fill="F7F8F6"/>
           </w:tcPr>
           <w:p>
+            <w:pPr>
+              <w:spacing w:after="40" w:before="40"/>
+              <w:jc w:val="right"/>
+            </w:pPr>
             <w:r>
               <w:rPr>
-                <w:sz w:val="20"/>
+                <w:rFonts w:ascii="Calibri" w:hAnsi="Calibri"/>
               </w:rPr>
             </w:r>
             <w:r>
               <w:rPr>
-                <w:sz w:val="20"/>
+                <w:rFonts w:ascii="Calibri" w:hAnsi="Calibri"/>
+                <w:sz w:val="19"/>
               </w:rPr>
               <w:t>0.334</w:t>
             </w:r>
@@ -1810,14 +2393,18 @@
             <w:tcW w:type="dxa" w:w="1872"/>
           </w:tcPr>
           <w:p>
+            <w:pPr>
+              <w:spacing w:after="40" w:before="40"/>
+            </w:pPr>
             <w:r>
               <w:rPr>
-                <w:sz w:val="20"/>
+                <w:rFonts w:ascii="Calibri" w:hAnsi="Calibri"/>
               </w:rPr>
             </w:r>
             <w:r>
               <w:rPr>
-                <w:sz w:val="20"/>
+                <w:rFonts w:ascii="Calibri" w:hAnsi="Calibri"/>
+                <w:sz w:val="19"/>
               </w:rPr>
               <w:t>boosting</w:t>
             </w:r>
@@ -1828,14 +2415,18 @@
             <w:tcW w:type="dxa" w:w="1872"/>
           </w:tcPr>
           <w:p>
+            <w:pPr>
+              <w:spacing w:after="40" w:before="40"/>
+            </w:pPr>
             <w:r>
               <w:rPr>
-                <w:sz w:val="20"/>
+                <w:rFonts w:ascii="Calibri" w:hAnsi="Calibri"/>
               </w:rPr>
             </w:r>
             <w:r>
               <w:rPr>
-                <w:sz w:val="20"/>
+                <w:rFonts w:ascii="Calibri" w:hAnsi="Calibri"/>
+                <w:sz w:val="19"/>
               </w:rPr>
               <w:t>embedding</w:t>
             </w:r>
@@ -1846,14 +2437,19 @@
             <w:tcW w:type="dxa" w:w="1872"/>
           </w:tcPr>
           <w:p>
+            <w:pPr>
+              <w:spacing w:after="40" w:before="40"/>
+              <w:jc w:val="right"/>
+            </w:pPr>
             <w:r>
               <w:rPr>
-                <w:sz w:val="20"/>
+                <w:rFonts w:ascii="Calibri" w:hAnsi="Calibri"/>
               </w:rPr>
             </w:r>
             <w:r>
               <w:rPr>
-                <w:sz w:val="20"/>
+                <w:rFonts w:ascii="Calibri" w:hAnsi="Calibri"/>
+                <w:sz w:val="19"/>
               </w:rPr>
               <w:t>256</w:t>
             </w:r>
@@ -1864,14 +2460,19 @@
             <w:tcW w:type="dxa" w:w="1872"/>
           </w:tcPr>
           <w:p>
+            <w:pPr>
+              <w:spacing w:after="40" w:before="40"/>
+              <w:jc w:val="right"/>
+            </w:pPr>
             <w:r>
               <w:rPr>
-                <w:sz w:val="20"/>
+                <w:rFonts w:ascii="Calibri" w:hAnsi="Calibri"/>
               </w:rPr>
             </w:r>
             <w:r>
               <w:rPr>
-                <w:sz w:val="20"/>
+                <w:rFonts w:ascii="Calibri" w:hAnsi="Calibri"/>
+                <w:sz w:val="19"/>
               </w:rPr>
               <w:t>0.805</w:t>
             </w:r>
@@ -1882,14 +2483,19 @@
             <w:tcW w:type="dxa" w:w="1872"/>
           </w:tcPr>
           <w:p>
+            <w:pPr>
+              <w:spacing w:after="40" w:before="40"/>
+              <w:jc w:val="right"/>
+            </w:pPr>
             <w:r>
               <w:rPr>
-                <w:sz w:val="20"/>
+                <w:rFonts w:ascii="Calibri" w:hAnsi="Calibri"/>
               </w:rPr>
             </w:r>
             <w:r>
               <w:rPr>
-                <w:sz w:val="20"/>
+                <w:rFonts w:ascii="Calibri" w:hAnsi="Calibri"/>
+                <w:sz w:val="19"/>
               </w:rPr>
               <w:t>0.393</w:t>
             </w:r>
@@ -1900,17 +2506,22 @@
         <w:tc>
           <w:tcPr>
             <w:tcW w:type="dxa" w:w="1872"/>
+            <w:shd w:val="clear" w:fill="F7F8F6"/>
           </w:tcPr>
           <w:p>
+            <w:pPr>
+              <w:spacing w:after="40" w:before="40"/>
+            </w:pPr>
             <w:r>
               <w:rPr>
-                <w:sz w:val="20"/>
+                <w:rFonts w:ascii="Calibri" w:hAnsi="Calibri"/>
               </w:rPr>
             </w:r>
             <w:r>
               <w:rPr>
+                <w:rFonts w:ascii="Calibri" w:hAnsi="Calibri"/>
                 <w:b/>
-                <w:sz w:val="20"/>
+                <w:sz w:val="19"/>
               </w:rPr>
               <w:t>boosting</w:t>
             </w:r>
@@ -1919,17 +2530,22 @@
         <w:tc>
           <w:tcPr>
             <w:tcW w:type="dxa" w:w="1872"/>
+            <w:shd w:val="clear" w:fill="F7F8F6"/>
           </w:tcPr>
           <w:p>
+            <w:pPr>
+              <w:spacing w:after="40" w:before="40"/>
+            </w:pPr>
             <w:r>
               <w:rPr>
-                <w:sz w:val="20"/>
+                <w:rFonts w:ascii="Calibri" w:hAnsi="Calibri"/>
               </w:rPr>
             </w:r>
             <w:r>
               <w:rPr>
+                <w:rFonts w:ascii="Calibri" w:hAnsi="Calibri"/>
                 <w:b/>
-                <w:sz w:val="20"/>
+                <w:sz w:val="19"/>
               </w:rPr>
               <w:t>both</w:t>
             </w:r>
@@ -1938,17 +2554,23 @@
         <w:tc>
           <w:tcPr>
             <w:tcW w:type="dxa" w:w="1872"/>
+            <w:shd w:val="clear" w:fill="F7F8F6"/>
           </w:tcPr>
           <w:p>
+            <w:pPr>
+              <w:spacing w:after="40" w:before="40"/>
+              <w:jc w:val="right"/>
+            </w:pPr>
             <w:r>
               <w:rPr>
-                <w:sz w:val="20"/>
+                <w:rFonts w:ascii="Calibri" w:hAnsi="Calibri"/>
               </w:rPr>
             </w:r>
             <w:r>
               <w:rPr>
+                <w:rFonts w:ascii="Calibri" w:hAnsi="Calibri"/>
                 <w:b/>
-                <w:sz w:val="20"/>
+                <w:sz w:val="19"/>
               </w:rPr>
               <w:t>278</w:t>
             </w:r>
@@ -1957,17 +2579,23 @@
         <w:tc>
           <w:tcPr>
             <w:tcW w:type="dxa" w:w="1872"/>
+            <w:shd w:val="clear" w:fill="F7F8F6"/>
           </w:tcPr>
           <w:p>
+            <w:pPr>
+              <w:spacing w:after="40" w:before="40"/>
+              <w:jc w:val="right"/>
+            </w:pPr>
             <w:r>
               <w:rPr>
-                <w:sz w:val="20"/>
+                <w:rFonts w:ascii="Calibri" w:hAnsi="Calibri"/>
               </w:rPr>
             </w:r>
             <w:r>
               <w:rPr>
+                <w:rFonts w:ascii="Calibri" w:hAnsi="Calibri"/>
                 <w:b/>
-                <w:sz w:val="20"/>
+                <w:sz w:val="19"/>
               </w:rPr>
               <w:t>0.819</w:t>
             </w:r>
@@ -1976,17 +2604,23 @@
         <w:tc>
           <w:tcPr>
             <w:tcW w:type="dxa" w:w="1872"/>
+            <w:shd w:val="clear" w:fill="F7F8F6"/>
           </w:tcPr>
           <w:p>
+            <w:pPr>
+              <w:spacing w:after="40" w:before="40"/>
+              <w:jc w:val="right"/>
+            </w:pPr>
             <w:r>
               <w:rPr>
-                <w:sz w:val="20"/>
+                <w:rFonts w:ascii="Calibri" w:hAnsi="Calibri"/>
               </w:rPr>
             </w:r>
             <w:r>
               <w:rPr>
+                <w:rFonts w:ascii="Calibri" w:hAnsi="Calibri"/>
                 <w:b/>
-                <w:sz w:val="20"/>
+                <w:sz w:val="19"/>
               </w:rPr>
               <w:t>0.423</w:t>
             </w:r>
@@ -1994,7 +2628,11 @@
         </w:tc>
       </w:tr>
     </w:tbl>
-    <w:p/>
+    <w:p>
+      <w:pPr>
+        <w:spacing w:after="80"/>
+      </w:pPr>
+    </w:p>
     <w:p>
       <w:r>
         <w:t>Validation split, majority-class baseline 0.846.</w:t>
@@ -2025,9 +2663,6 @@
         <w:pStyle w:val="Heading3"/>
       </w:pPr>
       <w:r>
-        <w:rPr>
-          <w:color w:val="14171A"/>
-        </w:rPr>
         <w:t>3.3 A feature that shouldn't have been there</w:t>
       </w:r>
     </w:p>
@@ -2038,8 +2673,8 @@
       <w:r>
         <w:rPr>
           <w:rFonts w:ascii="Consolas" w:hAnsi="Consolas"/>
-          <w:color w:val="4B7B6E"/>
-          <w:sz w:val="19"/>
+          <w:color w:val="8B4A6B"/>
+          <w:sz w:val="18"/>
         </w:rPr>
         <w:t>num_choices</w:t>
       </w:r>
@@ -2054,8 +2689,8 @@
       <w:r>
         <w:rPr>
           <w:rFonts w:ascii="Consolas" w:hAnsi="Consolas"/>
-          <w:color w:val="4B7B6E"/>
-          <w:sz w:val="19"/>
+          <w:color w:val="8B4A6B"/>
+          <w:sz w:val="18"/>
         </w:rPr>
         <w:t>num_choices</w:t>
       </w:r>
@@ -2080,8 +2715,8 @@
       <w:r>
         <w:rPr>
           <w:rFonts w:ascii="Consolas" w:hAnsi="Consolas"/>
-          <w:color w:val="4B7B6E"/>
-          <w:sz w:val="19"/>
+          <w:color w:val="8B4A6B"/>
+          <w:sz w:val="18"/>
         </w:rPr>
         <w:t>handcrafted_features</w:t>
       </w:r>
@@ -2094,9 +2729,6 @@
         <w:pStyle w:val="Heading3"/>
       </w:pPr>
       <w:r>
-        <w:rPr>
-          <w:color w:val="14171A"/>
-        </w:rPr>
         <w:t>3.4 Calibration</w:t>
       </w:r>
     </w:p>
@@ -2110,6 +2742,7 @@
         <w:tblStyle w:val="TableGrid"/>
         <w:tblW w:type="auto" w:w="0"/>
         <w:jc w:val="center"/>
+        <w:tblLayout w:type="autofit"/>
         <w:tblLook w:firstColumn="1" w:firstRow="1" w:lastColumn="0" w:lastRow="0" w:noHBand="0" w:noVBand="1" w:val="04A0"/>
       </w:tblPr>
       <w:tblGrid>
@@ -2123,19 +2756,23 @@
         <w:tc>
           <w:tcPr>
             <w:tcW w:type="dxa" w:w="1872"/>
-            <w:shd w:fill="EAEEE8"/>
+            <w:shd w:val="clear" w:fill="EAEEE8"/>
           </w:tcPr>
           <w:p>
+            <w:pPr>
+              <w:spacing w:after="60" w:before="60"/>
+            </w:pPr>
             <w:r>
               <w:rPr>
+                <w:rFonts w:ascii="Calibri" w:hAnsi="Calibri"/>
                 <w:b/>
-                <w:sz w:val="20"/>
               </w:rPr>
             </w:r>
             <w:r>
               <w:rPr>
+                <w:rFonts w:ascii="Calibri" w:hAnsi="Calibri"/>
                 <w:b/>
-                <w:sz w:val="20"/>
+                <w:sz w:val="19"/>
               </w:rPr>
               <w:t>Confidence</w:t>
             </w:r>
@@ -2144,19 +2781,23 @@
         <w:tc>
           <w:tcPr>
             <w:tcW w:type="dxa" w:w="1872"/>
-            <w:shd w:fill="EAEEE8"/>
+            <w:shd w:val="clear" w:fill="EAEEE8"/>
           </w:tcPr>
           <w:p>
+            <w:pPr>
+              <w:spacing w:after="60" w:before="60"/>
+            </w:pPr>
             <w:r>
               <w:rPr>
+                <w:rFonts w:ascii="Calibri" w:hAnsi="Calibri"/>
                 <w:b/>
-                <w:sz w:val="20"/>
               </w:rPr>
             </w:r>
             <w:r>
               <w:rPr>
+                <w:rFonts w:ascii="Calibri" w:hAnsi="Calibri"/>
                 <w:b/>
-                <w:sz w:val="20"/>
+                <w:sz w:val="19"/>
               </w:rPr>
               <w:t>n</w:t>
             </w:r>
@@ -2165,19 +2806,23 @@
         <w:tc>
           <w:tcPr>
             <w:tcW w:type="dxa" w:w="1872"/>
-            <w:shd w:fill="EAEEE8"/>
+            <w:shd w:val="clear" w:fill="EAEEE8"/>
           </w:tcPr>
           <w:p>
+            <w:pPr>
+              <w:spacing w:after="60" w:before="60"/>
+            </w:pPr>
             <w:r>
               <w:rPr>
+                <w:rFonts w:ascii="Calibri" w:hAnsi="Calibri"/>
                 <w:b/>
-                <w:sz w:val="20"/>
               </w:rPr>
             </w:r>
             <w:r>
               <w:rPr>
+                <w:rFonts w:ascii="Calibri" w:hAnsi="Calibri"/>
                 <w:b/>
-                <w:sz w:val="20"/>
+                <w:sz w:val="19"/>
               </w:rPr>
               <w:t>Mean confidence</w:t>
             </w:r>
@@ -2186,19 +2831,23 @@
         <w:tc>
           <w:tcPr>
             <w:tcW w:type="dxa" w:w="1872"/>
-            <w:shd w:fill="EAEEE8"/>
+            <w:shd w:val="clear" w:fill="EAEEE8"/>
           </w:tcPr>
           <w:p>
+            <w:pPr>
+              <w:spacing w:after="60" w:before="60"/>
+            </w:pPr>
             <w:r>
               <w:rPr>
+                <w:rFonts w:ascii="Calibri" w:hAnsi="Calibri"/>
                 <w:b/>
-                <w:sz w:val="20"/>
               </w:rPr>
             </w:r>
             <w:r>
               <w:rPr>
+                <w:rFonts w:ascii="Calibri" w:hAnsi="Calibri"/>
                 <w:b/>
-                <w:sz w:val="20"/>
+                <w:sz w:val="19"/>
               </w:rPr>
               <w:t>Actual accuracy</w:t>
             </w:r>
@@ -2207,19 +2856,23 @@
         <w:tc>
           <w:tcPr>
             <w:tcW w:type="dxa" w:w="1872"/>
-            <w:shd w:fill="EAEEE8"/>
+            <w:shd w:val="clear" w:fill="EAEEE8"/>
           </w:tcPr>
           <w:p>
+            <w:pPr>
+              <w:spacing w:after="60" w:before="60"/>
+            </w:pPr>
             <w:r>
               <w:rPr>
+                <w:rFonts w:ascii="Calibri" w:hAnsi="Calibri"/>
                 <w:b/>
-                <w:sz w:val="20"/>
               </w:rPr>
             </w:r>
             <w:r>
               <w:rPr>
+                <w:rFonts w:ascii="Calibri" w:hAnsi="Calibri"/>
                 <w:b/>
-                <w:sz w:val="20"/>
+                <w:sz w:val="19"/>
               </w:rPr>
               <w:t>Gap</w:t>
             </w:r>
@@ -2232,14 +2885,18 @@
             <w:tcW w:type="dxa" w:w="1872"/>
           </w:tcPr>
           <w:p>
+            <w:pPr>
+              <w:spacing w:after="40" w:before="40"/>
+            </w:pPr>
             <w:r>
               <w:rPr>
-                <w:sz w:val="20"/>
+                <w:rFonts w:ascii="Calibri" w:hAnsi="Calibri"/>
               </w:rPr>
             </w:r>
             <w:r>
               <w:rPr>
-                <w:sz w:val="20"/>
+                <w:rFonts w:ascii="Calibri" w:hAnsi="Calibri"/>
+                <w:sz w:val="19"/>
               </w:rPr>
               <w:t>0.5–0.6</w:t>
             </w:r>
@@ -2250,14 +2907,19 @@
             <w:tcW w:type="dxa" w:w="1872"/>
           </w:tcPr>
           <w:p>
+            <w:pPr>
+              <w:spacing w:after="40" w:before="40"/>
+              <w:jc w:val="right"/>
+            </w:pPr>
             <w:r>
               <w:rPr>
-                <w:sz w:val="20"/>
+                <w:rFonts w:ascii="Calibri" w:hAnsi="Calibri"/>
               </w:rPr>
             </w:r>
             <w:r>
               <w:rPr>
-                <w:sz w:val="20"/>
+                <w:rFonts w:ascii="Calibri" w:hAnsi="Calibri"/>
+                <w:sz w:val="19"/>
               </w:rPr>
               <w:t>1</w:t>
             </w:r>
@@ -2268,14 +2930,19 @@
             <w:tcW w:type="dxa" w:w="1872"/>
           </w:tcPr>
           <w:p>
+            <w:pPr>
+              <w:spacing w:after="40" w:before="40"/>
+              <w:jc w:val="right"/>
+            </w:pPr>
             <w:r>
               <w:rPr>
-                <w:sz w:val="20"/>
+                <w:rFonts w:ascii="Calibri" w:hAnsi="Calibri"/>
               </w:rPr>
             </w:r>
             <w:r>
               <w:rPr>
-                <w:sz w:val="20"/>
+                <w:rFonts w:ascii="Calibri" w:hAnsi="Calibri"/>
+                <w:sz w:val="19"/>
               </w:rPr>
               <w:t>0.561</w:t>
             </w:r>
@@ -2286,14 +2953,19 @@
             <w:tcW w:type="dxa" w:w="1872"/>
           </w:tcPr>
           <w:p>
+            <w:pPr>
+              <w:spacing w:after="40" w:before="40"/>
+              <w:jc w:val="right"/>
+            </w:pPr>
             <w:r>
               <w:rPr>
-                <w:sz w:val="20"/>
+                <w:rFonts w:ascii="Calibri" w:hAnsi="Calibri"/>
               </w:rPr>
             </w:r>
             <w:r>
               <w:rPr>
-                <w:sz w:val="20"/>
+                <w:rFonts w:ascii="Calibri" w:hAnsi="Calibri"/>
+                <w:sz w:val="19"/>
               </w:rPr>
               <w:t>1.000</w:t>
             </w:r>
@@ -2304,14 +2976,19 @@
             <w:tcW w:type="dxa" w:w="1872"/>
           </w:tcPr>
           <w:p>
+            <w:pPr>
+              <w:spacing w:after="40" w:before="40"/>
+              <w:jc w:val="right"/>
+            </w:pPr>
             <w:r>
               <w:rPr>
-                <w:sz w:val="20"/>
+                <w:rFonts w:ascii="Calibri" w:hAnsi="Calibri"/>
               </w:rPr>
             </w:r>
             <w:r>
               <w:rPr>
-                <w:sz w:val="20"/>
+                <w:rFonts w:ascii="Calibri" w:hAnsi="Calibri"/>
+                <w:sz w:val="19"/>
               </w:rPr>
               <w:t>+0.439</w:t>
             </w:r>
@@ -2322,16 +2999,21 @@
         <w:tc>
           <w:tcPr>
             <w:tcW w:type="dxa" w:w="1872"/>
+            <w:shd w:val="clear" w:fill="F7F8F6"/>
           </w:tcPr>
           <w:p>
+            <w:pPr>
+              <w:spacing w:after="40" w:before="40"/>
+            </w:pPr>
             <w:r>
               <w:rPr>
-                <w:sz w:val="20"/>
+                <w:rFonts w:ascii="Calibri" w:hAnsi="Calibri"/>
               </w:rPr>
             </w:r>
             <w:r>
               <w:rPr>
-                <w:sz w:val="20"/>
+                <w:rFonts w:ascii="Calibri" w:hAnsi="Calibri"/>
+                <w:sz w:val="19"/>
               </w:rPr>
               <w:t>0.6–0.7</w:t>
             </w:r>
@@ -2340,16 +3022,22 @@
         <w:tc>
           <w:tcPr>
             <w:tcW w:type="dxa" w:w="1872"/>
+            <w:shd w:val="clear" w:fill="F7F8F6"/>
           </w:tcPr>
           <w:p>
+            <w:pPr>
+              <w:spacing w:after="40" w:before="40"/>
+              <w:jc w:val="right"/>
+            </w:pPr>
             <w:r>
               <w:rPr>
-                <w:sz w:val="20"/>
+                <w:rFonts w:ascii="Calibri" w:hAnsi="Calibri"/>
               </w:rPr>
             </w:r>
             <w:r>
               <w:rPr>
-                <w:sz w:val="20"/>
+                <w:rFonts w:ascii="Calibri" w:hAnsi="Calibri"/>
+                <w:sz w:val="19"/>
               </w:rPr>
               <w:t>4</w:t>
             </w:r>
@@ -2358,16 +3046,22 @@
         <w:tc>
           <w:tcPr>
             <w:tcW w:type="dxa" w:w="1872"/>
+            <w:shd w:val="clear" w:fill="F7F8F6"/>
           </w:tcPr>
           <w:p>
+            <w:pPr>
+              <w:spacing w:after="40" w:before="40"/>
+              <w:jc w:val="right"/>
+            </w:pPr>
             <w:r>
               <w:rPr>
-                <w:sz w:val="20"/>
+                <w:rFonts w:ascii="Calibri" w:hAnsi="Calibri"/>
               </w:rPr>
             </w:r>
             <w:r>
               <w:rPr>
-                <w:sz w:val="20"/>
+                <w:rFonts w:ascii="Calibri" w:hAnsi="Calibri"/>
+                <w:sz w:val="19"/>
               </w:rPr>
               <w:t>0.674</w:t>
             </w:r>
@@ -2376,16 +3070,22 @@
         <w:tc>
           <w:tcPr>
             <w:tcW w:type="dxa" w:w="1872"/>
+            <w:shd w:val="clear" w:fill="F7F8F6"/>
           </w:tcPr>
           <w:p>
+            <w:pPr>
+              <w:spacing w:after="40" w:before="40"/>
+              <w:jc w:val="right"/>
+            </w:pPr>
             <w:r>
               <w:rPr>
-                <w:sz w:val="20"/>
+                <w:rFonts w:ascii="Calibri" w:hAnsi="Calibri"/>
               </w:rPr>
             </w:r>
             <w:r>
               <w:rPr>
-                <w:sz w:val="20"/>
+                <w:rFonts w:ascii="Calibri" w:hAnsi="Calibri"/>
+                <w:sz w:val="19"/>
               </w:rPr>
               <w:t>0.500</w:t>
             </w:r>
@@ -2394,16 +3094,22 @@
         <w:tc>
           <w:tcPr>
             <w:tcW w:type="dxa" w:w="1872"/>
+            <w:shd w:val="clear" w:fill="F7F8F6"/>
           </w:tcPr>
           <w:p>
+            <w:pPr>
+              <w:spacing w:after="40" w:before="40"/>
+              <w:jc w:val="right"/>
+            </w:pPr>
             <w:r>
               <w:rPr>
-                <w:sz w:val="20"/>
+                <w:rFonts w:ascii="Calibri" w:hAnsi="Calibri"/>
               </w:rPr>
             </w:r>
             <w:r>
               <w:rPr>
-                <w:sz w:val="20"/>
+                <w:rFonts w:ascii="Calibri" w:hAnsi="Calibri"/>
+                <w:sz w:val="19"/>
               </w:rPr>
               <w:t>−0.174</w:t>
             </w:r>
@@ -2416,14 +3122,18 @@
             <w:tcW w:type="dxa" w:w="1872"/>
           </w:tcPr>
           <w:p>
+            <w:pPr>
+              <w:spacing w:after="40" w:before="40"/>
+            </w:pPr>
             <w:r>
               <w:rPr>
-                <w:sz w:val="20"/>
+                <w:rFonts w:ascii="Calibri" w:hAnsi="Calibri"/>
               </w:rPr>
             </w:r>
             <w:r>
               <w:rPr>
-                <w:sz w:val="20"/>
+                <w:rFonts w:ascii="Calibri" w:hAnsi="Calibri"/>
+                <w:sz w:val="19"/>
               </w:rPr>
               <w:t>0.7–0.8</w:t>
             </w:r>
@@ -2434,14 +3144,19 @@
             <w:tcW w:type="dxa" w:w="1872"/>
           </w:tcPr>
           <w:p>
+            <w:pPr>
+              <w:spacing w:after="40" w:before="40"/>
+              <w:jc w:val="right"/>
+            </w:pPr>
             <w:r>
               <w:rPr>
-                <w:sz w:val="20"/>
+                <w:rFonts w:ascii="Calibri" w:hAnsi="Calibri"/>
               </w:rPr>
             </w:r>
             <w:r>
               <w:rPr>
-                <w:sz w:val="20"/>
+                <w:rFonts w:ascii="Calibri" w:hAnsi="Calibri"/>
+                <w:sz w:val="19"/>
               </w:rPr>
               <w:t>8</w:t>
             </w:r>
@@ -2452,14 +3167,19 @@
             <w:tcW w:type="dxa" w:w="1872"/>
           </w:tcPr>
           <w:p>
+            <w:pPr>
+              <w:spacing w:after="40" w:before="40"/>
+              <w:jc w:val="right"/>
+            </w:pPr>
             <w:r>
               <w:rPr>
-                <w:sz w:val="20"/>
+                <w:rFonts w:ascii="Calibri" w:hAnsi="Calibri"/>
               </w:rPr>
             </w:r>
             <w:r>
               <w:rPr>
-                <w:sz w:val="20"/>
+                <w:rFonts w:ascii="Calibri" w:hAnsi="Calibri"/>
+                <w:sz w:val="19"/>
               </w:rPr>
               <w:t>0.754</w:t>
             </w:r>
@@ -2470,14 +3190,19 @@
             <w:tcW w:type="dxa" w:w="1872"/>
           </w:tcPr>
           <w:p>
+            <w:pPr>
+              <w:spacing w:after="40" w:before="40"/>
+              <w:jc w:val="right"/>
+            </w:pPr>
             <w:r>
               <w:rPr>
-                <w:sz w:val="20"/>
+                <w:rFonts w:ascii="Calibri" w:hAnsi="Calibri"/>
               </w:rPr>
             </w:r>
             <w:r>
               <w:rPr>
-                <w:sz w:val="20"/>
+                <w:rFonts w:ascii="Calibri" w:hAnsi="Calibri"/>
+                <w:sz w:val="19"/>
               </w:rPr>
               <w:t>0.875</w:t>
             </w:r>
@@ -2488,14 +3213,19 @@
             <w:tcW w:type="dxa" w:w="1872"/>
           </w:tcPr>
           <w:p>
+            <w:pPr>
+              <w:spacing w:after="40" w:before="40"/>
+              <w:jc w:val="right"/>
+            </w:pPr>
             <w:r>
               <w:rPr>
-                <w:sz w:val="20"/>
+                <w:rFonts w:ascii="Calibri" w:hAnsi="Calibri"/>
               </w:rPr>
             </w:r>
             <w:r>
               <w:rPr>
-                <w:sz w:val="20"/>
+                <w:rFonts w:ascii="Calibri" w:hAnsi="Calibri"/>
+                <w:sz w:val="19"/>
               </w:rPr>
               <w:t>+0.121</w:t>
             </w:r>
@@ -2506,16 +3236,21 @@
         <w:tc>
           <w:tcPr>
             <w:tcW w:type="dxa" w:w="1872"/>
+            <w:shd w:val="clear" w:fill="F7F8F6"/>
           </w:tcPr>
           <w:p>
+            <w:pPr>
+              <w:spacing w:after="40" w:before="40"/>
+            </w:pPr>
             <w:r>
               <w:rPr>
-                <w:sz w:val="20"/>
+                <w:rFonts w:ascii="Calibri" w:hAnsi="Calibri"/>
               </w:rPr>
             </w:r>
             <w:r>
               <w:rPr>
-                <w:sz w:val="20"/>
+                <w:rFonts w:ascii="Calibri" w:hAnsi="Calibri"/>
+                <w:sz w:val="19"/>
               </w:rPr>
               <w:t>0.8–1.0</w:t>
             </w:r>
@@ -2524,16 +3259,22 @@
         <w:tc>
           <w:tcPr>
             <w:tcW w:type="dxa" w:w="1872"/>
+            <w:shd w:val="clear" w:fill="F7F8F6"/>
           </w:tcPr>
           <w:p>
+            <w:pPr>
+              <w:spacing w:after="40" w:before="40"/>
+              <w:jc w:val="right"/>
+            </w:pPr>
             <w:r>
               <w:rPr>
-                <w:sz w:val="20"/>
+                <w:rFonts w:ascii="Calibri" w:hAnsi="Calibri"/>
               </w:rPr>
             </w:r>
             <w:r>
               <w:rPr>
-                <w:sz w:val="20"/>
+                <w:rFonts w:ascii="Calibri" w:hAnsi="Calibri"/>
+                <w:sz w:val="19"/>
               </w:rPr>
               <w:t>136</w:t>
             </w:r>
@@ -2542,16 +3283,22 @@
         <w:tc>
           <w:tcPr>
             <w:tcW w:type="dxa" w:w="1872"/>
+            <w:shd w:val="clear" w:fill="F7F8F6"/>
           </w:tcPr>
           <w:p>
+            <w:pPr>
+              <w:spacing w:after="40" w:before="40"/>
+              <w:jc w:val="right"/>
+            </w:pPr>
             <w:r>
               <w:rPr>
-                <w:sz w:val="20"/>
+                <w:rFonts w:ascii="Calibri" w:hAnsi="Calibri"/>
               </w:rPr>
             </w:r>
             <w:r>
               <w:rPr>
-                <w:sz w:val="20"/>
+                <w:rFonts w:ascii="Calibri" w:hAnsi="Calibri"/>
+                <w:sz w:val="19"/>
               </w:rPr>
               <w:t>0.946</w:t>
             </w:r>
@@ -2560,16 +3307,22 @@
         <w:tc>
           <w:tcPr>
             <w:tcW w:type="dxa" w:w="1872"/>
+            <w:shd w:val="clear" w:fill="F7F8F6"/>
           </w:tcPr>
           <w:p>
+            <w:pPr>
+              <w:spacing w:after="40" w:before="40"/>
+              <w:jc w:val="right"/>
+            </w:pPr>
             <w:r>
               <w:rPr>
-                <w:sz w:val="20"/>
+                <w:rFonts w:ascii="Calibri" w:hAnsi="Calibri"/>
               </w:rPr>
             </w:r>
             <w:r>
               <w:rPr>
-                <w:sz w:val="20"/>
+                <w:rFonts w:ascii="Calibri" w:hAnsi="Calibri"/>
+                <w:sz w:val="19"/>
               </w:rPr>
               <w:t>0.824</w:t>
             </w:r>
@@ -2578,16 +3331,22 @@
         <w:tc>
           <w:tcPr>
             <w:tcW w:type="dxa" w:w="1872"/>
+            <w:shd w:val="clear" w:fill="F7F8F6"/>
           </w:tcPr>
           <w:p>
+            <w:pPr>
+              <w:spacing w:after="40" w:before="40"/>
+              <w:jc w:val="right"/>
+            </w:pPr>
             <w:r>
               <w:rPr>
-                <w:sz w:val="20"/>
+                <w:rFonts w:ascii="Calibri" w:hAnsi="Calibri"/>
               </w:rPr>
             </w:r>
             <w:r>
               <w:rPr>
-                <w:sz w:val="20"/>
+                <w:rFonts w:ascii="Calibri" w:hAnsi="Calibri"/>
+                <w:sz w:val="19"/>
               </w:rPr>
               <w:t>−0.122</w:t>
             </w:r>
@@ -2595,7 +3354,11 @@
         </w:tc>
       </w:tr>
     </w:tbl>
-    <w:p/>
+    <w:p>
+      <w:pPr>
+        <w:spacing w:after="80"/>
+      </w:pPr>
+    </w:p>
     <w:p>
       <w:r>
         <w:t>The first three rows have 13 questions between them, so I wouldn't read much into them. The last row is the one that counts: 136 of 149 validation questions land there, and in that band the model claims 0.946 and is right 0.824 of the time. It is confidently wrong about 12% of the time on the traffic that matters.</w:t>
@@ -2611,9 +3374,6 @@
         <w:pStyle w:val="Heading3"/>
       </w:pPr>
       <w:r>
-        <w:rPr>
-          <w:color w:val="14171A"/>
-        </w:rPr>
         <w:t>3.5 Why I think it failed</w:t>
       </w:r>
     </w:p>
@@ -2646,8 +3406,8 @@
       <w:r>
         <w:rPr>
           <w:rFonts w:ascii="Consolas" w:hAnsi="Consolas"/>
-          <w:color w:val="4B7B6E"/>
-          <w:sz w:val="19"/>
+          <w:color w:val="8B4A6B"/>
+          <w:sz w:val="18"/>
         </w:rPr>
         <w:t>llama-3.1-8b-instant</w:t>
       </w:r>
@@ -2671,9 +3431,6 @@
         <w:pStyle w:val="Heading3"/>
       </w:pPr>
       <w:r>
-        <w:rPr>
-          <w:color w:val="14171A"/>
-        </w:rPr>
         <w:t>3.6 What I'd do differently</w:t>
       </w:r>
     </w:p>
@@ -2695,11 +3452,9 @@
     <w:p>
       <w:pPr>
         <w:pStyle w:val="Heading2"/>
+        <w:pageBreakBefore/>
       </w:pPr>
       <w:r>
-        <w:rPr>
-          <w:color w:val="14171A"/>
-        </w:rPr>
         <w:t>4. The verifier</w:t>
       </w:r>
     </w:p>
@@ -2729,8 +3484,8 @@
       <w:r>
         <w:rPr>
           <w:rFonts w:ascii="Consolas" w:hAnsi="Consolas"/>
-          <w:color w:val="4B7B6E"/>
-          <w:sz w:val="19"/>
+          <w:color w:val="8B4A6B"/>
+          <w:sz w:val="18"/>
         </w:rPr>
         <w:t>Verifier.verify</w:t>
       </w:r>
@@ -2740,8 +3495,8 @@
       <w:r>
         <w:rPr>
           <w:rFonts w:ascii="Consolas" w:hAnsi="Consolas"/>
-          <w:color w:val="4B7B6E"/>
-          <w:sz w:val="19"/>
+          <w:color w:val="8B4A6B"/>
+          <w:sz w:val="18"/>
         </w:rPr>
         <w:t>exclude_providers={answered_by_provider}</w:t>
       </w:r>
@@ -2773,9 +3528,6 @@
         <w:pStyle w:val="Heading2"/>
       </w:pPr>
       <w:r>
-        <w:rPr>
-          <w:color w:val="14171A"/>
-        </w:rPr>
         <w:t>5. Catalog drift</w:t>
       </w:r>
     </w:p>
@@ -2797,8 +3549,8 @@
       <w:r>
         <w:rPr>
           <w:rFonts w:ascii="Consolas" w:hAnsi="Consolas"/>
-          <w:color w:val="4B7B6E"/>
-          <w:sz w:val="19"/>
+          <w:color w:val="8B4A6B"/>
+          <w:sz w:val="18"/>
         </w:rPr>
         <w:t>gemini-2.5-flash</w:t>
       </w:r>
@@ -2808,8 +3560,8 @@
       <w:r>
         <w:rPr>
           <w:rFonts w:ascii="Consolas" w:hAnsi="Consolas"/>
-          <w:color w:val="4B7B6E"/>
-          <w:sz w:val="19"/>
+          <w:color w:val="8B4A6B"/>
+          <w:sz w:val="18"/>
         </w:rPr>
         <w:t>gemini-2.5-pro</w:t>
       </w:r>
@@ -2819,13 +3571,22 @@
       <w:r>
         <w:rPr>
           <w:rFonts w:ascii="Consolas" w:hAnsi="Consolas"/>
-          <w:color w:val="4B7B6E"/>
-          <w:sz w:val="19"/>
+          <w:color w:val="8B4A6B"/>
+          <w:sz w:val="18"/>
         </w:rPr>
         <w:t>gemini-2.5-flash-lite</w:t>
       </w:r>
       <w:r>
-        <w:t xml:space="preserve"> all appear in the model-list endpoint. All three return HTTP 404 when you actually call them — *"no longer available to new users."* My first tier table was built straight from the catalog, and it was silently unroutable. A drift detector that only diffs model lists would have reported everything as fine.</w:t>
+        <w:t xml:space="preserve"> all appear in the model-list endpoint. All three return HTTP 404 when you actually call them — </w:t>
+      </w:r>
+      <w:r>
+        <w:rPr>
+          <w:i/>
+        </w:rPr>
+        <w:t>"no longer available to new users."</w:t>
+      </w:r>
+      <w:r>
+        <w:t xml:space="preserve"> My first tier table was built straight from the catalog, and it was silently unroutable. A drift detector that only diffs model lists would have reported everything as fine.</w:t>
       </w:r>
     </w:p>
     <w:p>
@@ -2841,8 +3602,8 @@
       <w:r>
         <w:rPr>
           <w:rFonts w:ascii="Consolas" w:hAnsi="Consolas"/>
-          <w:color w:val="4B7B6E"/>
-          <w:sz w:val="19"/>
+          <w:color w:val="8B4A6B"/>
+          <w:sz w:val="18"/>
         </w:rPr>
         <w:t>HTTP 200</w:t>
       </w:r>
@@ -2852,8 +3613,8 @@
       <w:r>
         <w:rPr>
           <w:rFonts w:ascii="Consolas" w:hAnsi="Consolas"/>
-          <w:color w:val="4B7B6E"/>
-          <w:sz w:val="19"/>
+          <w:color w:val="8B4A6B"/>
+          <w:sz w:val="18"/>
         </w:rPr>
         <w:t>{"error": {"message": "Upstream error from Nvidia", "code": 502}}</w:t>
       </w:r>
@@ -2874,8 +3635,8 @@
       <w:r>
         <w:rPr>
           <w:rFonts w:ascii="Consolas" w:hAnsi="Consolas"/>
-          <w:color w:val="4B7B6E"/>
-          <w:sz w:val="19"/>
+          <w:color w:val="8B4A6B"/>
+          <w:sz w:val="18"/>
         </w:rPr>
         <w:t>google/gemma-4-31b-it:free</w:t>
       </w:r>
@@ -2891,11 +3652,9 @@
     <w:p>
       <w:pPr>
         <w:pStyle w:val="Heading2"/>
+        <w:pageBreakBefore/>
       </w:pPr>
       <w:r>
-        <w:rPr>
-          <w:color w:val="14171A"/>
-        </w:rPr>
         <w:t>6. Engineering notes</w:t>
       </w:r>
     </w:p>
@@ -2904,6 +3663,7 @@
         <w:tblStyle w:val="TableGrid"/>
         <w:tblW w:type="auto" w:w="0"/>
         <w:jc w:val="center"/>
+        <w:tblLayout w:type="autofit"/>
         <w:tblLook w:firstColumn="1" w:firstRow="1" w:lastColumn="0" w:lastRow="0" w:noHBand="0" w:noVBand="1" w:val="04A0"/>
       </w:tblPr>
       <w:tblGrid>
@@ -2914,46 +3674,23 @@
         <w:tc>
           <w:tcPr>
             <w:tcW w:type="dxa" w:w="4680"/>
-            <w:shd w:fill="EAEEE8"/>
+            <w:shd w:val="clear" w:fill="EAEEE8"/>
           </w:tcPr>
           <w:p>
+            <w:pPr>
+              <w:spacing w:after="60" w:before="60"/>
+            </w:pPr>
             <w:r>
               <w:rPr>
+                <w:rFonts w:ascii="Calibri" w:hAnsi="Calibri"/>
                 <w:b/>
-                <w:sz w:val="20"/>
-              </w:rPr>
-            </w:r>
-          </w:p>
-        </w:tc>
-        <w:tc>
-          <w:tcPr>
-            <w:tcW w:type="dxa" w:w="4680"/>
-            <w:shd w:fill="EAEEE8"/>
-          </w:tcPr>
-          <w:p>
-            <w:r>
-              <w:rPr>
-                <w:b/>
-                <w:sz w:val="20"/>
-              </w:rPr>
-            </w:r>
-          </w:p>
-        </w:tc>
-      </w:tr>
-      <w:tr>
-        <w:tc>
-          <w:tcPr>
-            <w:tcW w:type="dxa" w:w="4680"/>
-          </w:tcPr>
-          <w:p>
-            <w:r>
-              <w:rPr>
-                <w:sz w:val="20"/>
               </w:rPr>
             </w:r>
             <w:r>
               <w:rPr>
-                <w:sz w:val="20"/>
+                <w:rFonts w:ascii="Calibri" w:hAnsi="Calibri"/>
+                <w:b/>
+                <w:sz w:val="19"/>
               </w:rPr>
               <w:t>Tests</w:t>
             </w:r>
@@ -2962,16 +3699,23 @@
         <w:tc>
           <w:tcPr>
             <w:tcW w:type="dxa" w:w="4680"/>
+            <w:shd w:val="clear" w:fill="EAEEE8"/>
           </w:tcPr>
           <w:p>
+            <w:pPr>
+              <w:spacing w:after="60" w:before="60"/>
+            </w:pPr>
             <w:r>
               <w:rPr>
-                <w:sz w:val="20"/>
+                <w:rFonts w:ascii="Calibri" w:hAnsi="Calibri"/>
+                <w:b/>
               </w:rPr>
             </w:r>
             <w:r>
               <w:rPr>
-                <w:sz w:val="20"/>
+                <w:rFonts w:ascii="Calibri" w:hAnsi="Calibri"/>
+                <w:b/>
+                <w:sz w:val="19"/>
               </w:rPr>
               <w:t>323, passing offline with no API keys set</w:t>
             </w:r>
@@ -2984,14 +3728,18 @@
             <w:tcW w:type="dxa" w:w="4680"/>
           </w:tcPr>
           <w:p>
+            <w:pPr>
+              <w:spacing w:after="40" w:before="40"/>
+            </w:pPr>
             <w:r>
               <w:rPr>
-                <w:sz w:val="20"/>
+                <w:rFonts w:ascii="Calibri" w:hAnsi="Calibri"/>
               </w:rPr>
             </w:r>
             <w:r>
               <w:rPr>
-                <w:sz w:val="20"/>
+                <w:rFonts w:ascii="Calibri" w:hAnsi="Calibri"/>
+                <w:sz w:val="19"/>
               </w:rPr>
               <w:t>Lint / types</w:t>
             </w:r>
@@ -3002,36 +3750,41 @@
             <w:tcW w:type="dxa" w:w="4680"/>
           </w:tcPr>
           <w:p>
+            <w:pPr>
+              <w:spacing w:after="40" w:before="40"/>
+            </w:pPr>
             <w:r>
               <w:rPr>
-                <w:sz w:val="20"/>
+                <w:rFonts w:ascii="Calibri" w:hAnsi="Calibri"/>
               </w:rPr>
             </w:r>
             <w:r>
               <w:rPr>
                 <w:rFonts w:ascii="Consolas" w:hAnsi="Consolas"/>
-                <w:color w:val="4B7B6E"/>
-                <w:sz w:val="20"/>
+                <w:color w:val="8B4A6B"/>
+                <w:sz w:val="19"/>
               </w:rPr>
               <w:t>ruff</w:t>
             </w:r>
             <w:r>
               <w:rPr>
-                <w:sz w:val="20"/>
+                <w:rFonts w:ascii="Calibri" w:hAnsi="Calibri"/>
+                <w:sz w:val="19"/>
               </w:rPr>
               <w:t xml:space="preserve"> and </w:t>
             </w:r>
             <w:r>
               <w:rPr>
                 <w:rFonts w:ascii="Consolas" w:hAnsi="Consolas"/>
-                <w:color w:val="4B7B6E"/>
-                <w:sz w:val="20"/>
+                <w:color w:val="8B4A6B"/>
+                <w:sz w:val="19"/>
               </w:rPr>
               <w:t>mypy --strict</w:t>
             </w:r>
             <w:r>
               <w:rPr>
-                <w:sz w:val="20"/>
+                <w:rFonts w:ascii="Calibri" w:hAnsi="Calibri"/>
+                <w:sz w:val="19"/>
               </w:rPr>
               <w:t xml:space="preserve"> clean</w:t>
             </w:r>
@@ -3042,16 +3795,21 @@
         <w:tc>
           <w:tcPr>
             <w:tcW w:type="dxa" w:w="4680"/>
+            <w:shd w:val="clear" w:fill="F7F8F6"/>
           </w:tcPr>
           <w:p>
+            <w:pPr>
+              <w:spacing w:after="40" w:before="40"/>
+            </w:pPr>
             <w:r>
               <w:rPr>
-                <w:sz w:val="20"/>
+                <w:rFonts w:ascii="Calibri" w:hAnsi="Calibri"/>
               </w:rPr>
             </w:r>
             <w:r>
               <w:rPr>
-                <w:sz w:val="20"/>
+                <w:rFonts w:ascii="Calibri" w:hAnsi="Calibri"/>
+                <w:sz w:val="19"/>
               </w:rPr>
               <w:t>Adapters</w:t>
             </w:r>
@@ -3060,16 +3818,21 @@
         <w:tc>
           <w:tcPr>
             <w:tcW w:type="dxa" w:w="4680"/>
+            <w:shd w:val="clear" w:fill="F7F8F6"/>
           </w:tcPr>
           <w:p>
+            <w:pPr>
+              <w:spacing w:after="40" w:before="40"/>
+            </w:pPr>
             <w:r>
               <w:rPr>
-                <w:sz w:val="20"/>
+                <w:rFonts w:ascii="Calibri" w:hAnsi="Calibri"/>
               </w:rPr>
             </w:r>
             <w:r>
               <w:rPr>
-                <w:sz w:val="20"/>
+                <w:rFonts w:ascii="Calibri" w:hAnsi="Calibri"/>
+                <w:sz w:val="19"/>
               </w:rPr>
               <w:t>3, all against one 28-assertion shared contract suite</w:t>
             </w:r>
@@ -3082,14 +3845,18 @@
             <w:tcW w:type="dxa" w:w="4680"/>
           </w:tcPr>
           <w:p>
+            <w:pPr>
+              <w:spacing w:after="40" w:before="40"/>
+            </w:pPr>
             <w:r>
               <w:rPr>
-                <w:sz w:val="20"/>
+                <w:rFonts w:ascii="Calibri" w:hAnsi="Calibri"/>
               </w:rPr>
             </w:r>
             <w:r>
               <w:rPr>
-                <w:sz w:val="20"/>
+                <w:rFonts w:ascii="Calibri" w:hAnsi="Calibri"/>
+                <w:sz w:val="19"/>
               </w:rPr>
               <w:t>Classifier artifact</w:t>
             </w:r>
@@ -3100,14 +3867,18 @@
             <w:tcW w:type="dxa" w:w="4680"/>
           </w:tcPr>
           <w:p>
+            <w:pPr>
+              <w:spacing w:after="40" w:before="40"/>
+            </w:pPr>
             <w:r>
               <w:rPr>
-                <w:sz w:val="20"/>
+                <w:rFonts w:ascii="Calibri" w:hAnsi="Calibri"/>
               </w:rPr>
             </w:r>
             <w:r>
               <w:rPr>
-                <w:sz w:val="20"/>
+                <w:rFonts w:ascii="Calibri" w:hAnsi="Calibri"/>
+                <w:sz w:val="19"/>
               </w:rPr>
               <w:t>565 KB</w:t>
             </w:r>
@@ -3118,16 +3889,21 @@
         <w:tc>
           <w:tcPr>
             <w:tcW w:type="dxa" w:w="4680"/>
+            <w:shd w:val="clear" w:fill="F7F8F6"/>
           </w:tcPr>
           <w:p>
+            <w:pPr>
+              <w:spacing w:after="40" w:before="40"/>
+            </w:pPr>
             <w:r>
               <w:rPr>
-                <w:sz w:val="20"/>
+                <w:rFonts w:ascii="Calibri" w:hAnsi="Calibri"/>
               </w:rPr>
             </w:r>
             <w:r>
               <w:rPr>
-                <w:sz w:val="20"/>
+                <w:rFonts w:ascii="Calibri" w:hAnsi="Calibri"/>
+                <w:sz w:val="19"/>
               </w:rPr>
               <w:t>Commits</w:t>
             </w:r>
@@ -3136,16 +3912,21 @@
         <w:tc>
           <w:tcPr>
             <w:tcW w:type="dxa" w:w="4680"/>
+            <w:shd w:val="clear" w:fill="F7F8F6"/>
           </w:tcPr>
           <w:p>
+            <w:pPr>
+              <w:spacing w:after="40" w:before="40"/>
+            </w:pPr>
             <w:r>
               <w:rPr>
-                <w:sz w:val="20"/>
+                <w:rFonts w:ascii="Calibri" w:hAnsi="Calibri"/>
               </w:rPr>
             </w:r>
             <w:r>
               <w:rPr>
-                <w:sz w:val="20"/>
+                <w:rFonts w:ascii="Calibri" w:hAnsi="Calibri"/>
+                <w:sz w:val="19"/>
               </w:rPr>
               <w:t>53</w:t>
             </w:r>
@@ -3158,14 +3939,18 @@
             <w:tcW w:type="dxa" w:w="4680"/>
           </w:tcPr>
           <w:p>
+            <w:pPr>
+              <w:spacing w:after="40" w:before="40"/>
+            </w:pPr>
             <w:r>
               <w:rPr>
-                <w:sz w:val="20"/>
+                <w:rFonts w:ascii="Calibri" w:hAnsi="Calibri"/>
               </w:rPr>
             </w:r>
             <w:r>
               <w:rPr>
-                <w:sz w:val="20"/>
+                <w:rFonts w:ascii="Calibri" w:hAnsi="Calibri"/>
+                <w:sz w:val="19"/>
               </w:rPr>
               <w:t>Groq latency</w:t>
             </w:r>
@@ -3176,14 +3961,18 @@
             <w:tcW w:type="dxa" w:w="4680"/>
           </w:tcPr>
           <w:p>
+            <w:pPr>
+              <w:spacing w:after="40" w:before="40"/>
+            </w:pPr>
             <w:r>
               <w:rPr>
-                <w:sz w:val="20"/>
+                <w:rFonts w:ascii="Calibri" w:hAnsi="Calibri"/>
               </w:rPr>
             </w:r>
             <w:r>
               <w:rPr>
-                <w:sz w:val="20"/>
+                <w:rFonts w:ascii="Calibri" w:hAnsi="Calibri"/>
+                <w:sz w:val="19"/>
               </w:rPr>
               <w:t>126 ms</w:t>
             </w:r>
@@ -3194,16 +3983,21 @@
         <w:tc>
           <w:tcPr>
             <w:tcW w:type="dxa" w:w="4680"/>
+            <w:shd w:val="clear" w:fill="F7F8F6"/>
           </w:tcPr>
           <w:p>
+            <w:pPr>
+              <w:spacing w:after="40" w:before="40"/>
+            </w:pPr>
             <w:r>
               <w:rPr>
-                <w:sz w:val="20"/>
+                <w:rFonts w:ascii="Calibri" w:hAnsi="Calibri"/>
               </w:rPr>
             </w:r>
             <w:r>
               <w:rPr>
-                <w:sz w:val="20"/>
+                <w:rFonts w:ascii="Calibri" w:hAnsi="Calibri"/>
+                <w:sz w:val="19"/>
               </w:rPr>
               <w:t>Gemini latency</w:t>
             </w:r>
@@ -3212,16 +4006,21 @@
         <w:tc>
           <w:tcPr>
             <w:tcW w:type="dxa" w:w="4680"/>
+            <w:shd w:val="clear" w:fill="F7F8F6"/>
           </w:tcPr>
           <w:p>
+            <w:pPr>
+              <w:spacing w:after="40" w:before="40"/>
+            </w:pPr>
             <w:r>
               <w:rPr>
-                <w:sz w:val="20"/>
+                <w:rFonts w:ascii="Calibri" w:hAnsi="Calibri"/>
               </w:rPr>
             </w:r>
             <w:r>
               <w:rPr>
-                <w:sz w:val="20"/>
+                <w:rFonts w:ascii="Calibri" w:hAnsi="Calibri"/>
+                <w:sz w:val="19"/>
               </w:rPr>
               <w:t>908 ms</w:t>
             </w:r>
@@ -3234,14 +4033,18 @@
             <w:tcW w:type="dxa" w:w="4680"/>
           </w:tcPr>
           <w:p>
+            <w:pPr>
+              <w:spacing w:after="40" w:before="40"/>
+            </w:pPr>
             <w:r>
               <w:rPr>
-                <w:sz w:val="20"/>
+                <w:rFonts w:ascii="Calibri" w:hAnsi="Calibri"/>
               </w:rPr>
             </w:r>
             <w:r>
               <w:rPr>
-                <w:sz w:val="20"/>
+                <w:rFonts w:ascii="Calibri" w:hAnsi="Calibri"/>
+                <w:sz w:val="19"/>
               </w:rPr>
               <w:t>OpenRouter (free) latency</w:t>
             </w:r>
@@ -3252,14 +4055,18 @@
             <w:tcW w:type="dxa" w:w="4680"/>
           </w:tcPr>
           <w:p>
+            <w:pPr>
+              <w:spacing w:after="40" w:before="40"/>
+            </w:pPr>
             <w:r>
               <w:rPr>
-                <w:sz w:val="20"/>
+                <w:rFonts w:ascii="Calibri" w:hAnsi="Calibri"/>
               </w:rPr>
             </w:r>
             <w:r>
               <w:rPr>
-                <w:sz w:val="20"/>
+                <w:rFonts w:ascii="Calibri" w:hAnsi="Calibri"/>
+                <w:sz w:val="19"/>
               </w:rPr>
               <w:t>27.5 s</w:t>
             </w:r>
@@ -3270,16 +4077,21 @@
         <w:tc>
           <w:tcPr>
             <w:tcW w:type="dxa" w:w="4680"/>
+            <w:shd w:val="clear" w:fill="F7F8F6"/>
           </w:tcPr>
           <w:p>
+            <w:pPr>
+              <w:spacing w:after="40" w:before="40"/>
+            </w:pPr>
             <w:r>
               <w:rPr>
-                <w:sz w:val="20"/>
+                <w:rFonts w:ascii="Calibri" w:hAnsi="Calibri"/>
               </w:rPr>
             </w:r>
             <w:r>
               <w:rPr>
-                <w:sz w:val="20"/>
+                <w:rFonts w:ascii="Calibri" w:hAnsi="Calibri"/>
+                <w:sz w:val="19"/>
               </w:rPr>
               <w:t>Labelling run</w:t>
             </w:r>
@@ -3288,16 +4100,21 @@
         <w:tc>
           <w:tcPr>
             <w:tcW w:type="dxa" w:w="4680"/>
+            <w:shd w:val="clear" w:fill="F7F8F6"/>
           </w:tcPr>
           <w:p>
+            <w:pPr>
+              <w:spacing w:after="40" w:before="40"/>
+            </w:pPr>
             <w:r>
               <w:rPr>
-                <w:sz w:val="20"/>
+                <w:rFonts w:ascii="Calibri" w:hAnsi="Calibri"/>
               </w:rPr>
             </w:r>
             <w:r>
               <w:rPr>
-                <w:sz w:val="20"/>
+                <w:rFonts w:ascii="Calibri" w:hAnsi="Calibri"/>
+                <w:sz w:val="19"/>
               </w:rPr>
               <w:t>1,249 questions, 1 provider error</w:t>
             </w:r>
@@ -3305,7 +4122,11 @@
         </w:tc>
       </w:tr>
     </w:tbl>
-    <w:p/>
+    <w:p>
+      <w:pPr>
+        <w:spacing w:after="80"/>
+      </w:pPr>
+    </w:p>
     <w:p>
       <w:r>
         <w:t>Three things I learned the hard way.</w:t>
@@ -3319,7 +4140,16 @@
         <w:t>Rate limits are counted in tokens, not requests.</w:t>
       </w:r>
       <w:r>
-        <w:t xml:space="preserve"> Groq allows 14,400 requests a day but only 6,000 tokens a minute. My first labelling attempt used four concurrent workers and lost 9 questions out of 60 to exhausted retries. I replaced it with a pacer that reserves token budget *before* sending, and the full 1,249-question run finished with a single error. Reacting to a 429 after it arrives is already too late — by then the budget is spent and everything in flight is about to fail too.</w:t>
+        <w:t xml:space="preserve"> Groq allows 14,400 requests a day but only 6,000 tokens a minute. My first labelling attempt used four concurrent workers and lost 9 questions out of 60 to exhausted retries. I replaced it with a pacer that reserves token budget </w:t>
+      </w:r>
+      <w:r>
+        <w:rPr>
+          <w:i/>
+        </w:rPr>
+        <w:t>before</w:t>
+      </w:r>
+      <w:r>
+        <w:t xml:space="preserve"> sending, and the full 1,249-question run finished with a single error. Reacting to a 429 after it arrives is already too late — by then the budget is spent and everything in flight is about to fail too.</w:t>
       </w:r>
     </w:p>
     <w:p>
@@ -3346,8 +4176,8 @@
       <w:r>
         <w:rPr>
           <w:rFonts w:ascii="Consolas" w:hAnsi="Consolas"/>
-          <w:color w:val="4B7B6E"/>
-          <w:sz w:val="19"/>
+          <w:color w:val="8B4A6B"/>
+          <w:sz w:val="18"/>
         </w:rPr>
         <w:t>prediction_source: "no_embedding"</w:t>
       </w:r>
@@ -3360,9 +4190,6 @@
         <w:pStyle w:val="Heading2"/>
       </w:pPr>
       <w:r>
-        <w:rPr>
-          <w:color w:val="14171A"/>
-        </w:rPr>
         <w:t>7. Deployment</w:t>
       </w:r>
     </w:p>
@@ -3389,8 +4216,8 @@
       <w:r>
         <w:rPr>
           <w:rFonts w:ascii="Consolas" w:hAnsi="Consolas"/>
-          <w:color w:val="4B7B6E"/>
-          <w:sz w:val="19"/>
+          <w:color w:val="8B4A6B"/>
+          <w:sz w:val="18"/>
         </w:rPr>
         <w:t>push</w:t>
       </w:r>
@@ -3400,8 +4227,8 @@
       <w:r>
         <w:rPr>
           <w:rFonts w:ascii="Consolas" w:hAnsi="Consolas"/>
-          <w:color w:val="4B7B6E"/>
-          <w:sz w:val="19"/>
+          <w:color w:val="8B4A6B"/>
+          <w:sz w:val="18"/>
         </w:rPr>
         <w:t>v0.1-proposal</w:t>
       </w:r>
@@ -3422,8 +4249,8 @@
       <w:r>
         <w:rPr>
           <w:rFonts w:ascii="Consolas" w:hAnsi="Consolas"/>
-          <w:color w:val="4B7B6E"/>
-          <w:sz w:val="19"/>
+          <w:color w:val="8B4A6B"/>
+          <w:sz w:val="18"/>
         </w:rPr>
         <w:t>DATABASE_URL</w:t>
       </w:r>
@@ -3433,8 +4260,8 @@
       <w:r>
         <w:rPr>
           <w:rFonts w:ascii="Consolas" w:hAnsi="Consolas"/>
-          <w:color w:val="4B7B6E"/>
-          <w:sz w:val="19"/>
+          <w:color w:val="8B4A6B"/>
+          <w:sz w:val="18"/>
         </w:rPr>
         <w:t>ModuleNotFoundError: No module named 'psycopg2'</w:t>
       </w:r>
@@ -3466,8 +4293,8 @@
       <w:r>
         <w:rPr>
           <w:rFonts w:ascii="Consolas" w:hAnsi="Consolas"/>
-          <w:color w:val="4B7B6E"/>
-          <w:sz w:val="19"/>
+          <w:color w:val="8B4A6B"/>
+          <w:sz w:val="18"/>
         </w:rPr>
         <w:t>NEXT_PUBLIC_API_BASE</w:t>
       </w:r>
@@ -3477,8 +4304,8 @@
       <w:r>
         <w:rPr>
           <w:rFonts w:ascii="Consolas" w:hAnsi="Consolas"/>
-          <w:color w:val="4B7B6E"/>
-          <w:sz w:val="19"/>
+          <w:color w:val="8B4A6B"/>
+          <w:sz w:val="18"/>
         </w:rPr>
         <w:t>NEXT_PUBLIC_</w:t>
       </w:r>
@@ -3488,8 +4315,8 @@
       <w:r>
         <w:rPr>
           <w:rFonts w:ascii="Consolas" w:hAnsi="Consolas"/>
-          <w:color w:val="4B7B6E"/>
-          <w:sz w:val="19"/>
+          <w:color w:val="8B4A6B"/>
+          <w:sz w:val="18"/>
         </w:rPr>
         <w:t>127.0.0.1:8000</w:t>
       </w:r>
@@ -3505,17 +4332,16 @@
     <w:p>
       <w:pPr>
         <w:pStyle w:val="Heading2"/>
+        <w:pageBreakBefore/>
       </w:pPr>
       <w:r>
-        <w:rPr>
-          <w:color w:val="14171A"/>
-        </w:rPr>
         <w:t>8. Limitations</w:t>
       </w:r>
     </w:p>
     <w:p>
       <w:pPr>
         <w:pStyle w:val="ListNumber"/>
+        <w:spacing w:after="80"/>
       </w:pPr>
       <w:r>
         <w:rPr>
@@ -3530,6 +4356,7 @@
     <w:p>
       <w:pPr>
         <w:pStyle w:val="ListNumber"/>
+        <w:spacing w:after="80"/>
       </w:pPr>
       <w:r>
         <w:rPr>
@@ -3544,6 +4371,7 @@
     <w:p>
       <w:pPr>
         <w:pStyle w:val="ListNumber"/>
+        <w:spacing w:after="80"/>
       </w:pPr>
       <w:r>
         <w:rPr>
@@ -3558,6 +4386,7 @@
     <w:p>
       <w:pPr>
         <w:pStyle w:val="ListNumber"/>
+        <w:spacing w:after="80"/>
       </w:pPr>
       <w:r>
         <w:rPr>
@@ -3572,6 +4401,7 @@
     <w:p>
       <w:pPr>
         <w:pStyle w:val="ListNumber"/>
+        <w:spacing w:after="80"/>
       </w:pPr>
       <w:r>
         <w:rPr>
@@ -3586,6 +4416,7 @@
     <w:p>
       <w:pPr>
         <w:pStyle w:val="ListNumber"/>
+        <w:spacing w:after="80"/>
       </w:pPr>
       <w:r>
         <w:rPr>
@@ -3600,6 +4431,7 @@
     <w:p>
       <w:pPr>
         <w:pStyle w:val="ListNumber"/>
+        <w:spacing w:after="80"/>
       </w:pPr>
       <w:r>
         <w:rPr>
@@ -3608,12 +4440,22 @@
         <w:t>The verifier's threshold of 0.7 and cap of 2 escalations are untuned.</w:t>
       </w:r>
       <w:r>
-        <w:t xml:space="preserve"> They came from the specification. Tuning them properly would need a labelled set of good and bad *answers*, which I don't have — my labels record whether a model was correct, not whether the judge agreed.</w:t>
+        <w:t xml:space="preserve"> They came from the specification. Tuning them properly would need a labelled set of good and bad </w:t>
+      </w:r>
+      <w:r>
+        <w:rPr>
+          <w:i/>
+        </w:rPr>
+        <w:t>answers</w:t>
+      </w:r>
+      <w:r>
+        <w:t>, which I don't have — my labels record whether a model was correct, not whether the judge agreed.</w:t>
       </w:r>
     </w:p>
     <w:p>
       <w:pPr>
         <w:pStyle w:val="ListNumber"/>
+        <w:spacing w:after="80"/>
       </w:pPr>
       <w:r>
         <w:rPr>
@@ -3628,6 +4470,7 @@
     <w:p>
       <w:pPr>
         <w:pStyle w:val="ListNumber"/>
+        <w:spacing w:after="80"/>
       </w:pPr>
       <w:r>
         <w:rPr>
@@ -3642,6 +4485,7 @@
     <w:p>
       <w:pPr>
         <w:pStyle w:val="ListNumber"/>
+        <w:spacing w:after="80"/>
       </w:pPr>
       <w:r>
         <w:rPr>
@@ -3655,8 +4499,8 @@
       <w:r>
         <w:rPr>
           <w:rFonts w:ascii="Consolas" w:hAnsi="Consolas"/>
-          <w:color w:val="4B7B6E"/>
-          <w:sz w:val="19"/>
+          <w:color w:val="8B4A6B"/>
+          <w:sz w:val="18"/>
         </w:rPr>
         <w:t>docs/screenshots/</w:t>
       </w:r>
@@ -3669,9 +4513,6 @@
         <w:pStyle w:val="Heading2"/>
       </w:pPr>
       <w:r>
-        <w:rPr>
-          <w:color w:val="14171A"/>
-        </w:rPr>
         <w:t>9. Conclusion</w:t>
       </w:r>
     </w:p>
@@ -3701,13 +4542,86 @@
       </w:r>
     </w:p>
     <w:sectPr>
+      <w:headerReference w:type="default" r:id="rId9"/>
+      <w:footerReference w:type="default" r:id="rId10"/>
       <w:pgSz w:w="12240" w:h="15840"/>
-      <w:pgMar w:top="1296" w:right="1440" w:bottom="1296" w:left="1440" w:header="720" w:footer="720" w:gutter="0"/>
+      <w:pgMar w:top="1296" w:right="1440" w:bottom="1152" w:left="1440" w:header="720" w:footer="720" w:gutter="0"/>
       <w:cols w:space="720"/>
       <w:docGrid w:linePitch="360"/>
     </w:sectPr>
   </w:body>
 </w:document>
+</file>
+
+<file path=word/footer1.xml><?xml version="1.0" encoding="utf-8"?>
+<w:ftr xmlns:m="http://schemas.openxmlformats.org/officeDocument/2006/math" xmlns:mc="http://schemas.openxmlformats.org/markup-compatibility/2006" xmlns:mo="http://schemas.microsoft.com/office/mac/office/2008/main" xmlns:mv="urn:schemas-microsoft-com:mac:vml" xmlns:o="urn:schemas-microsoft-com:office:office" xmlns:r="http://schemas.openxmlformats.org/officeDocument/2006/relationships" xmlns:v="urn:schemas-microsoft-com:vml" xmlns:w10="urn:schemas-microsoft-com:office:word" xmlns:w14="http://schemas.microsoft.com/office/word/2010/wordml" xmlns:w="http://schemas.openxmlformats.org/wordprocessingml/2006/main" xmlns:wne="http://schemas.microsoft.com/office/word/2006/wordml" xmlns:wp14="http://schemas.microsoft.com/office/word/2010/wordprocessingDrawing" xmlns:wp="http://schemas.openxmlformats.org/drawingml/2006/wordprocessingDrawing" xmlns:wpc="http://schemas.microsoft.com/office/word/2010/wordprocessingCanvas" xmlns:wpg="http://schemas.microsoft.com/office/word/2010/wordprocessingGroup" xmlns:wpi="http://schemas.microsoft.com/office/word/2010/wordprocessingInk" xmlns:wps="http://schemas.microsoft.com/office/word/2010/wordprocessingShape" mc:Ignorable="w14 wp14">
+  <w:p>
+    <w:pPr>
+      <w:pStyle w:val="Footer"/>
+      <w:jc w:val="center"/>
+    </w:pPr>
+    <w:r>
+      <w:rPr>
+        <w:rFonts w:ascii="Calibri" w:hAnsi="Calibri"/>
+        <w:color w:val="6B7280"/>
+        <w:sz w:val="17"/>
+      </w:rPr>
+      <w:t xml:space="preserve">Page </w:t>
+    </w:r>
+    <w:r>
+      <w:rPr>
+        <w:rFonts w:ascii="Calibri" w:hAnsi="Calibri"/>
+        <w:color w:val="6B7280"/>
+        <w:sz w:val="17"/>
+      </w:rPr>
+      <w:fldChar w:fldCharType="begin"/>
+      <w:instrText xml:space="preserve">PAGE</w:instrText>
+      <w:fldChar w:fldCharType="separate"/>
+      <w:fldChar w:fldCharType="end"/>
+    </w:r>
+    <w:r>
+      <w:rPr>
+        <w:rFonts w:ascii="Calibri" w:hAnsi="Calibri"/>
+        <w:color w:val="6B7280"/>
+        <w:sz w:val="17"/>
+      </w:rPr>
+      <w:t xml:space="preserve"> of </w:t>
+    </w:r>
+    <w:r>
+      <w:rPr>
+        <w:rFonts w:ascii="Calibri" w:hAnsi="Calibri"/>
+        <w:color w:val="6B7280"/>
+        <w:sz w:val="17"/>
+      </w:rPr>
+      <w:fldChar w:fldCharType="begin"/>
+      <w:instrText xml:space="preserve">NUMPAGES</w:instrText>
+      <w:fldChar w:fldCharType="separate"/>
+      <w:fldChar w:fldCharType="end"/>
+    </w:r>
+  </w:p>
+</w:ftr>
+</file>
+
+<file path=word/header1.xml><?xml version="1.0" encoding="utf-8"?>
+<w:hdr xmlns:m="http://schemas.openxmlformats.org/officeDocument/2006/math" xmlns:mc="http://schemas.openxmlformats.org/markup-compatibility/2006" xmlns:mo="http://schemas.microsoft.com/office/mac/office/2008/main" xmlns:mv="urn:schemas-microsoft-com:mac:vml" xmlns:o="urn:schemas-microsoft-com:office:office" xmlns:r="http://schemas.openxmlformats.org/officeDocument/2006/relationships" xmlns:v="urn:schemas-microsoft-com:vml" xmlns:w10="urn:schemas-microsoft-com:office:word" xmlns:w14="http://schemas.microsoft.com/office/word/2010/wordml" xmlns:w="http://schemas.openxmlformats.org/wordprocessingml/2006/main" xmlns:wne="http://schemas.microsoft.com/office/word/2006/wordml" xmlns:wp14="http://schemas.microsoft.com/office/word/2010/wordprocessingDrawing" xmlns:wp="http://schemas.openxmlformats.org/drawingml/2006/wordprocessingDrawing" xmlns:wpc="http://schemas.microsoft.com/office/word/2010/wordprocessingCanvas" xmlns:wpg="http://schemas.microsoft.com/office/word/2010/wordprocessingGroup" xmlns:wpi="http://schemas.microsoft.com/office/word/2010/wordprocessingInk" xmlns:wps="http://schemas.microsoft.com/office/word/2010/wordprocessingShape" mc:Ignorable="w14 wp14">
+  <w:p>
+    <w:pPr>
+      <w:pStyle w:val="Header"/>
+      <w:jc w:val="right"/>
+      <w:pBdr>
+        <w:bottom w:val="single" w:sz="4" w:space="8" w:color="C9D2C6"/>
+      </w:pBdr>
+    </w:pPr>
+    <w:r>
+      <w:rPr>
+        <w:rFonts w:ascii="Calibri" w:hAnsi="Calibri"/>
+        <w:color w:val="6B7280"/>
+        <w:sz w:val="17"/>
+      </w:rPr>
+      <w:t>Cascade — Final Report</w:t>
+    </w:r>
+  </w:p>
+</w:hdr>
 </file>
 
 <file path=word/numbering.xml><?xml version="1.0" encoding="utf-8"?>
@@ -4074,11 +4988,12 @@
     <w:qFormat/>
     <w:rsid w:val="00FC693F"/>
     <w:pPr>
-      <w:spacing w:after="160" w:line="276" w:lineRule="auto"/>
+      <w:spacing w:after="180" w:line="300" w:lineRule="auto"/>
     </w:pPr>
     <w:rPr>
-      <w:rFonts w:ascii="Calibri" w:hAnsi="Calibri"/>
-      <w:sz w:val="22"/>
+      <w:rFonts w:ascii="Georgia" w:hAnsi="Georgia"/>
+      <w:color w:val="14171A"/>
+      <w:sz w:val="21"/>
     </w:rPr>
   </w:style>
   <w:style w:type="paragraph" w:styleId="Header">
@@ -4136,15 +5051,15 @@
     <w:pPr>
       <w:keepNext/>
       <w:keepLines/>
-      <w:spacing w:before="480" w:after="0"/>
+      <w:spacing w:before="440" w:after="120"/>
       <w:outlineLvl w:val="0"/>
     </w:pPr>
     <w:rPr>
-      <w:rFonts w:asciiTheme="majorHAnsi" w:eastAsiaTheme="majorEastAsia" w:hAnsiTheme="majorHAnsi" w:cstheme="majorBidi"/>
+      <w:rFonts w:asciiTheme="majorHAnsi" w:eastAsiaTheme="majorEastAsia" w:hAnsiTheme="majorHAnsi" w:cstheme="majorBidi" w:ascii="Calibri" w:hAnsi="Calibri"/>
       <w:b/>
       <w:bCs/>
-      <w:color w:val="365F91" w:themeColor="accent1" w:themeShade="BF"/>
-      <w:sz w:val="28"/>
+      <w:color w:val="4B7B6E"/>
+      <w:sz w:val="40"/>
       <w:szCs w:val="28"/>
     </w:rPr>
   </w:style>
@@ -4160,15 +5075,15 @@
     <w:pPr>
       <w:keepNext/>
       <w:keepLines/>
-      <w:spacing w:before="200" w:after="0"/>
+      <w:spacing w:before="360" w:after="120"/>
       <w:outlineLvl w:val="1"/>
     </w:pPr>
     <w:rPr>
-      <w:rFonts w:asciiTheme="majorHAnsi" w:eastAsiaTheme="majorEastAsia" w:hAnsiTheme="majorHAnsi" w:cstheme="majorBidi"/>
+      <w:rFonts w:asciiTheme="majorHAnsi" w:eastAsiaTheme="majorEastAsia" w:hAnsiTheme="majorHAnsi" w:cstheme="majorBidi" w:ascii="Calibri" w:hAnsi="Calibri"/>
       <w:b/>
       <w:bCs/>
-      <w:color w:val="4F81BD" w:themeColor="accent1"/>
-      <w:sz w:val="26"/>
+      <w:color w:val="14171A"/>
+      <w:sz w:val="30"/>
       <w:szCs w:val="26"/>
     </w:rPr>
   </w:style>
@@ -4184,14 +5099,15 @@
     <w:pPr>
       <w:keepNext/>
       <w:keepLines/>
-      <w:spacing w:before="200" w:after="0"/>
+      <w:spacing w:before="280" w:after="120"/>
       <w:outlineLvl w:val="2"/>
     </w:pPr>
     <w:rPr>
-      <w:rFonts w:asciiTheme="majorHAnsi" w:eastAsiaTheme="majorEastAsia" w:hAnsiTheme="majorHAnsi" w:cstheme="majorBidi"/>
+      <w:rFonts w:asciiTheme="majorHAnsi" w:eastAsiaTheme="majorEastAsia" w:hAnsiTheme="majorHAnsi" w:cstheme="majorBidi" w:ascii="Calibri" w:hAnsi="Calibri"/>
       <w:b/>
       <w:bCs/>
-      <w:color w:val="4F81BD" w:themeColor="accent1"/>
+      <w:color w:val="4B7B6E"/>
+      <w:sz w:val="24"/>
     </w:rPr>
   </w:style>
   <w:style w:type="paragraph" w:styleId="Heading4">
@@ -4207,16 +5123,17 @@
     <w:pPr>
       <w:keepNext/>
       <w:keepLines/>
-      <w:spacing w:before="200" w:after="0"/>
+      <w:spacing w:before="240" w:after="120"/>
       <w:outlineLvl w:val="3"/>
     </w:pPr>
     <w:rPr>
-      <w:rFonts w:asciiTheme="majorHAnsi" w:eastAsiaTheme="majorEastAsia" w:hAnsiTheme="majorHAnsi" w:cstheme="majorBidi"/>
+      <w:rFonts w:asciiTheme="majorHAnsi" w:eastAsiaTheme="majorEastAsia" w:hAnsiTheme="majorHAnsi" w:cstheme="majorBidi" w:ascii="Calibri" w:hAnsi="Calibri"/>
       <w:b/>
       <w:bCs/>
       <w:i/>
       <w:iCs/>
-      <w:color w:val="4F81BD" w:themeColor="accent1"/>
+      <w:color w:val="14171A"/>
+      <w:sz w:val="22"/>
     </w:rPr>
   </w:style>
   <w:style w:type="paragraph" w:styleId="Heading5">

</xml_diff>